<commit_message>
fix(research): reconcile scientific inconsistencies, audit drift references, and align manuscript with ground-truth data
</commit_message>
<xml_diff>
--- a/docs/research/manuscript_aerosentinel_draft.docx
+++ b/docs/research/manuscript_aerosentinel_draft.docx
@@ -89,7 +89,7 @@
                 <w:rFonts w:ascii="Times New Roman" w:hAnsi="Times New Roman"/>
                 <w:sz w:val="18"/>
               </w:rPr>
-              <w:t>Prognostics and Health Management (PHM) systems increasingly rely on gradient-boosted decision trees and ensemble regressors to predict the Remaining Useful Life (RUL) of aircraft turbofan engines from multi-channel telemetry. However, existing PHM architectures predominantly assume that model deployment pipelines are tamper-proof and that inflight or ground-transmitted sensor streams are authentic. In this study, we present AeroSentinel, a security-hardened prognostic pipeline that integrates cryptographic artifact authentication with multi-sensor statistical drift screening. Evaluating on the NASA C-MAPSS FD001 benchmark (100 run-to-failure training engines, 100 censored test engines), we first resolve an undocumented run-to-failure censoring asymmetry, demonstrating that screening operational test data against training baselines triggers an 8-channel false-positive alarm rate (&gt;57% of monitored sensors). By establishing an operational baseline, we evaluate the resilience of Kolmogorov-Smirnov and Population Stability Index (PSI) detectors under six synthetic sensor-manipulation scenarios targeting static High-Pressure Compressor pressure (s₁₁). Our empirical findings reveal severe blind spots: single-channel bias injections (±1σ to +2σ) and creeping ramps evade fleet-level drift alarms (≤1 PSI alert channel) while shifting RUL estimates by up to -12.1 cycles and degrading RMSE from 13.90 to 20.44. Furthermore, negative bias injection delays predicted engine retirement, elevating the Hazardous Prediction Rate (HPR, over-predicting RUL &gt;25 when true RUL ≤ 25) from 15.79% to 31.58%, and frozen sensor buffers surge NASA asymmetric penalty scores by over 2,600× with 100% HPR. To secure the pipeline against supply-chain attacks, we implement an Edwards-curve Digital Signature (Ed25519) verification scheme over RFC 8785 canonical JSON metadata; microbenchmarks (N=100) confirm that fail-closed artifact verification executes in 0.11 ± 0.01 ms, adding negligible overhead to deserialization (9.56 ms) and batch inference (1.47 ms). This research provides an empirical foundation for zero-trust predictive maintenance analytics in civil and defense aviation.</w:t>
+              <w:t>Prognostics and Health Management (PHM) systems deploy machine learning algorithms, notably gradient-boosted decision trees, to forecast the Remaining Useful Life (RUL) of aircraft turbofan engines from continuous telemetry. However, existing PHM architectures predominantly assume that model deployment pipelines are secure and that transmitted sensor streams are uncompromised. In this study, we present AeroSentinel, a threat-modeled predictive-maintenance framework that integrates Edwards-curve Digital Signature (Ed25519) artifact verification with multi-sensor statistical drift screening. Evaluating on the NASA C-MAPSS FD001 benchmark (100 run-to-failure training trajectories, 100 censored test trajectories), we first discover and resolve a survival censoring asymmetry: screening clean operational test telemetry directly against run-to-failure training baselines triggers an 8-channel false-positive alarm rate (&gt;53% of 15 monitored channels) due to physical degradation divergence. By establishing an operational baseline via a disjoint 50/50 engine partition, we evaluate the resilience of Kolmogorov-Smirnov and Population Stability Index (PSI) detectors under six synthetic sensor-manipulation scenarios targeting static High-Pressure Compressor outlet pressure (s₁₁). Our empirical findings reveal notable detection blind spots: single-channel step biases (±1.0σ to +2.0σ) and creeping ramps evade fleet-level drift alert thresholds (≤1 PSI alert channel), while shifting RUL estimates by up to -12.07 cycles and degrading unclipped RMSE from 13.9044 to 20.4374. Crucially, negative bias injection artificially masks wear, delaying predicted engine overhaul and elevating the Canonical Hazardous Prediction Rate (HPR, over-predicting RUL &gt;25 cycles when true RUL ≤ 25) from 15.79% to 31.58% (6/19 critical engines delayed) with zero PSI alert channels under disjoint evaluation. Frozen sensor replay forces an HPR of 100.0% and surges the NASA asymmetric penalty score by over 2,600× (791,878.67). To secure model supply chains against tampering and arbitrary bytecode deserialization, we implement Ed25519 signing over RFC 8785 canonical JSON metadata; microbenchmarks (N=100) confirm that fail-closed cryptographic verification executes in 0.13 ± 0.02 ms (median 0.11 ms), adding negligible overhead to total startup (24.37 ms) and batch inference (1.34 ms for 100 engines, 13.4 µs per engine). This investigation demonstrates the necessity of combining cryptographic integrity controls with domain-aware invariant validation for ground-side aviation analytics.</w:t>
             </w:r>
           </w:p>
           <w:p>
@@ -111,7 +111,7 @@
                 <w:i/>
                 <w:sz w:val="18"/>
               </w:rPr>
-              <w:t>Aircraft Predictive Maintenance, Prognostics and Health Management, Remaining Useful Life, Adversarial Machine Learning, Ed25519 Cryptographic Verification, Drift Detection, Sensor Spoofing, NASA C-MAPSS.</w:t>
+              <w:t>Aircraft Predictive Maintenance, Prognostics and Health Management, Remaining Useful Life, Adversarial Machine Learning, Cryptographic Artifact Authentication, Ed25519, Statistical Drift Detection, Sensor Manipulation, NASA C-MAPSS.</w:t>
             </w:r>
           </w:p>
         </w:tc>
@@ -141,7 +141,7 @@
           <w:rFonts w:ascii="Times New Roman" w:hAnsi="Times New Roman"/>
           <w:sz w:val="20"/>
         </w:rPr>
-        <w:t>Predictive maintenance in modern commercial and military aviation relies extensively on data-driven Prognostics and Health Management (PHM) architectures. By continuously analyzing real-time flight telematics—including spool speeds, total temperatures, and static bleed pressures—machine learning algorithms forecast the Remaining Useful Life (RUL) of safety-critical turbofan components. Accurate RUL predictions enable airline operators to transition from rigid, calendar-based maintenance schedules to condition-based maintenance, minimizing unscheduled Aircraft on Ground (AOG) events and mitigating catastrophic inflight mechanical failures [1], [2].</w:t>
+        <w:t>Predictive maintenance in modern commercial and military aviation relies extensively on data-driven Prognostics and Health Management (PHM) architectures. By analyzing multi-sensor flight telematics—including rotational spool speeds, static bleed pressures, and gas temperatures—machine learning algorithms forecast the Remaining Useful Life (RUL) of critical components, such as turbofan gas turbines. Accurate RUL estimates enable airline operators to transition from rigid calendar-based maintenance schedules to condition-based maintenance, minimizing unscheduled Aircraft on Ground (AOG) events and mitigating catastrophic inflight mechanical failures [1], [2].</w:t>
       </w:r>
     </w:p>
     <w:p>
@@ -154,7 +154,7 @@
           <w:rFonts w:ascii="Times New Roman" w:hAnsi="Times New Roman"/>
           <w:sz w:val="20"/>
         </w:rPr>
-        <w:t>Despite considerable algorithmic advances in deep neural networks and gradient-boosted decision tree ensembles [3], current aviation predictive maintenance models are engineered under the implicit assumption of an uncompromised operating environment. Telemetry streams are presumed to reflect true physical degradation, and persisted model artifacts are assumed to reside securely within trusted environments.</w:t>
+        <w:t>Despite considerable algorithmic advances in deep recurrent neural networks and gradient-boosted decision tree ensembles [2], [3], existing aircraft predictive maintenance models are engineered under the implicit assumption of a benign, uncorrupted operating environment. In-flight and ground-transmitted telemetry streams are assumed to accurately reflect true thermodynamic degradation, and serialized model artifacts are presumed to reside securely within trusted ground-station environments.</w:t>
       </w:r>
     </w:p>
     <w:p>
@@ -167,7 +167,7 @@
           <w:rFonts w:ascii="Times New Roman" w:hAnsi="Times New Roman"/>
           <w:sz w:val="20"/>
         </w:rPr>
-        <w:t>However, modern aviation data ecosystems are increasingly interconnected. Telemetry packets are routinely offloaded via Aircraft Communications Addressing and Reporting System (ACARS), Aeronautical Telecommunications Network (ATN), cellular ground-links (Gatelink), or portable data loaders during turnaround. This expanded attack surface exposes predictive analytics to both data-plane and control-plane threats [4], [5]:</w:t>
+        <w:t>However, modern aviation telematics ecosystems are increasingly distributed and interconnected. Sensor readings and post-flight telemetry summaries are routinely transferred via the Aircraft Communications Addressing and Reporting System (ACARS), cellular ground data links (Gatelink), and portable data terminals during turnaround. This expanded data interface introduces potential attack vectors across both data-plane and control-plane channels [4], [12]:</w:t>
       </w:r>
     </w:p>
     <w:p>
@@ -180,7 +180,7 @@
           <w:rFonts w:ascii="Times New Roman" w:hAnsi="Times New Roman"/>
           <w:sz w:val="20"/>
         </w:rPr>
-        <w:t>1) Supply-Chain Model Tampering: Adversaries with access to ground-station storage or model repositories may modify serialized estimator weights, feature scaler parameters, or metadata manifests to deliberately suppress maintenance warnings or execute arbitrary code via deserialization gadgets [6].</w:t>
+        <w:t>1) Supply-Chain Model-Artifact Tampering: Adversaries with read/write access to maintenance server storage or package repositories may alter serialized estimator weights, feature scaler parameters, or metadata manifests to deliberately suppress maintenance warnings or execute malicious code via Python deserialization gadget chains [4], [6].</w:t>
       </w:r>
     </w:p>
     <w:p>
@@ -193,7 +193,7 @@
           <w:rFonts w:ascii="Times New Roman" w:hAnsi="Times New Roman"/>
           <w:sz w:val="20"/>
         </w:rPr>
-        <w:t>2) Sensor Telemetry Manipulation: Compromised telematics gateways or Man-in-the-Middle (MitM) interceptors can inject subtle mathematical biases, frozen packet replays, or creeping calibration drifts into thermodynamic sensor streams, skewing RUL forecasts without triggering legacy threshold alarms [7], [8].</w:t>
+        <w:t>2) Sensor Telemetry Manipulation: Compromised telematics gateways or Man-in-the-Middle (MitM) interceptors can inject subtle mathematical biases, frozen packet replays, or creeping calibration drifts into thermodynamic sensor streams, skewing RUL forecasts without triggering coarse out-of-bounds alarms [7], [8].</w:t>
       </w:r>
     </w:p>
     <w:p>
@@ -206,7 +206,7 @@
           <w:rFonts w:ascii="Times New Roman" w:hAnsi="Times New Roman"/>
           <w:sz w:val="20"/>
         </w:rPr>
-        <w:t>In aviation maintenance, prediction errors are fundamentally asymmetric. An early prediction (under-predicting RUL) prompts premature engine overhaul, incurring avoidable operational expense. Conversely, a delayed prediction (over-predicting RUL) is catastrophic: it allows an engine on the verge of mechanical breakdown to continue operating, risking uncontained turbine blade failure [2]. Despite this criticality, existing literature lacks systematic evaluations of how lightweight integrity controls perform under adversarial data manipulation and what proportion of hazardous predictions can escape statistical detection.</w:t>
+        <w:t>In aviation maintenance, prediction errors carry fundamentally asymmetric operational consequences. An early prediction (under-predicting RUL) prompts premature engine inspection, incurring unnecessary operational downtime and maintenance labor costs. Conversely, a delayed prediction (over-predicting RUL) is potentially hazardous: it allows an engine on the verge of mechanical failure to remain dispatched, risking severe in-flight damage [1], [2]. Despite this asymmetry, the degree to which lightweight statistical drift monitors can detect subtle sensor manipulation and the proportion of hazardous predictions that can escape detection remain insufficiently quantified.</w:t>
       </w:r>
     </w:p>
     <w:p>
@@ -219,7 +219,7 @@
           <w:rFonts w:ascii="Times New Roman" w:hAnsi="Times New Roman"/>
           <w:sz w:val="20"/>
         </w:rPr>
-        <w:t>To address this gap, we introduce AeroSentinel, an integrity-assured predictive maintenance framework built on the NASA C-MAPSS turbofan benchmark. Our research makes five explicit contributions: (1) Dual-protocol baseline disambiguation between raw unclipped and clipped ground-truth; (2) Discovery and resolution of the run-to-failure censoring asymmetry in drift screening; (3) Systematic empirical resilience profiling across six synthetic sensor manipulation scenarios; (4) Sub-millisecond Ed25519 cryptographic artifact authentication; and (5) A fully reproducible open-source research suite.</w:t>
+        <w:t>To investigate these questions, we present AeroSentinel, an integrity-assured predictive maintenance framework evaluated on the NASA C-MAPSS FD001 turbofan benchmark. Our research makes five specific contributions: (1) Dual-protocol baseline disambiguation between raw unclipped and clipped ground-truth; (2) Discovery and resolution of the run-to-failure censoring asymmetry via a disjoint operational reference baseline; (3) Systematic empirical resilience profiling across six synthetic sensor manipulation scenarios; (4) Sub-millisecond Ed25519 cryptographic artifact authentication; and (5) A fully reproducible open-source research suite.</w:t>
       </w:r>
     </w:p>
     <w:p>
@@ -248,7 +248,7 @@
           <w:i/>
           <w:sz w:val="20"/>
         </w:rPr>
-        <w:t>A. Aircraft Prognostics &amp; The NASA C-MAPSS Benchmark</w:t>
+        <w:t>A. Aircraft Prognostics &amp; Benchmark Methodologies</w:t>
       </w:r>
     </w:p>
     <w:p>
@@ -261,7 +261,7 @@
           <w:rFonts w:ascii="Times New Roman" w:hAnsi="Times New Roman"/>
           <w:sz w:val="20"/>
         </w:rPr>
-        <w:t>The NASA Commercial Modular Aero-Propulsion System Simulation (C-MAPSS) dataset, released by Saxena et al. [1], represents the foundational benchmark for turbofan health prognostics. The FD001 sub-dataset captures high-pressure compressor degradation under steady-state sea-level conditions across 100 training and 100 test trajectories. Early landmark research by Heimes [2] established recurrent neural network architectures for RUL regression and introduced the piecewise-linear degradation model (capping RUL at 125 cycles) to reflect that un-degraded turbofans exhibit no measurable wear during initial operating cycles. Subsequent studies demonstrated that gradient-boosted decision trees (e.g., LightGBM, HistGradientBoosting) and deep convolution-LSTM models achieve state-of-the-art accuracy while maintaining high computational efficiency [3], [9]. However, existing C-MAPSS prognostics literature focuses almost exclusively on minimizing scalar regression metrics (RMSE, NASA asymmetric score) on clean datasets, without considering input integrity or model security.</w:t>
+        <w:t>The NASA Commercial Modular Aero-Propulsion System Simulation (C-MAPSS) benchmark released by Saxena et al. [1] is the primary standard for data-driven turbofan prognostics. In the FD001 sub-dataset, high-pressure compressor degradation is modeled under steady-state sea-level conditions across 100 training and 100 test trajectories. Ramasso and Saxena [2] surveyed over 70 C-MAPSS studies and documented pervasive benchmark reporting discrepancies, specifically highlighting the conflation of raw physical targets with piecewise-linear clipped targets (RUL_max = 125 cycles). While deep learning (e.g., LSTM networks by Zheng et al. [3]) and gradient-boosted decision trees achieve high predictive fidelity on clean benchmark data, these studies focus exclusively on regression accuracy, omitting integrity controls or adversarial evaluation.</w:t>
       </w:r>
     </w:p>
     <w:p>
@@ -276,7 +276,7 @@
           <w:i/>
           <w:sz w:val="20"/>
         </w:rPr>
-        <w:t>B. Machine Learning Integrity &amp; Supply-Chain Security</w:t>
+        <w:t>B. Machine Learning Integrity &amp; Artifact Authentication</w:t>
       </w:r>
     </w:p>
     <w:p>
@@ -289,7 +289,7 @@
           <w:rFonts w:ascii="Times New Roman" w:hAnsi="Times New Roman"/>
           <w:sz w:val="20"/>
         </w:rPr>
-        <w:t>The security of serialized machine learning artifacts has emerged as an urgent priority in applied artificial intelligence [5], [6]. Traditional Python model persistence mechanisms (e.g., pickle, joblib) deserialize arbitrary object state, making them susceptible to remote code execution (RCE) via malicious deserialization payloads. While cryptographic signing is standardized in binary distribution (e.g., Sigstore, TUF), its integration into predictive maintenance pipelines remains sparse. Previous implementations often rely on unauthenticated SHA-256 digests; however, as noted in NIST SP 800-57 [10], an unkeyed cryptographic hash provides integrity only against random transmission corruption, failing completely against an active attacker capable of rewriting both the artifact and its declared checksum.</w:t>
+        <w:t>The security of serialized machine learning models has gained increased attention as pipelines are integrated into critical infrastructure [4], [6]. Traditional persistence formats (such as Python pickle and joblib) deserialize arbitrary object state, exposing host environments to code execution vulnerabilities if model files are modified. Gu et al. [4] demonstrated that machine learning supply chains can harbor backdoors and modified weights without degrading clean accuracy. The National Institute of Standards and Technology (NIST) Special Publication 800-218 [6] explicitly recommends cryptographic signing of software and data artifacts. Bernstein et al. [5] introduced Ed25519 (Edwards-curve Digital Signature Algorithm over Curve25519), offering 128-bit security, high-speed verification, and resilience to side-channel timing attacks. However, standard predictive maintenance platforms commonly rely on unsigned SHA-256 checksums, which cannot prevent manifest rewrite attacks by an adversary with write access.</w:t>
       </w:r>
     </w:p>
     <w:p>
@@ -304,7 +304,7 @@
           <w:i/>
           <w:sz w:val="20"/>
         </w:rPr>
-        <w:t>C. Sensor Telemetry Attacks &amp; Adversarial Robustness</w:t>
+        <w:t>C. Sensor Telemetry Manipulation &amp; Drift Detection</w:t>
       </w:r>
     </w:p>
     <w:p>
@@ -317,7 +317,7 @@
           <w:rFonts w:ascii="Times New Roman" w:hAnsi="Times New Roman"/>
           <w:sz w:val="20"/>
         </w:rPr>
-        <w:t>Adversarial machine learning research has expanded from computer vision into cyber-physical time-series systems [4], [7]. In cyber-physical architectures, attackers can execute false data injection (FDI) attacks by spoofing sensor channels, offsetting temperature readings, or replaying historical telemetry packets [8]. While deep autoencoders and statistical change-point algorithms have been explored for anomaly detection, empirical evaluations demonstrate that adversaries who constrain perturbations within natural process variances can bias regressor outputs without violating physical bounds [7].</w:t>
+        <w:t>Adversarial machine learning research has expanded to cyber-physical time-series systems [7], [8]. Fawaz et al. [7] and Karim et al. [8] demonstrated that subtle, bounded perturbations in sequential sensor streams can cause severe prediction degradation. Mo et al. [12] analyzed replay and sensor bias attacks on cyber-physical systems, proving that intelligent replay can evade traditional Kalman filter residual checks. For continuous monitoring, production systems frequently employ non-parametric tests, such as the two-sample Kolmogorov-Smirnov (KS) test [11] and the Population Stability Index (PSI) [10]. However, Rabanser et al. [9] demonstrated in empirical studies (Failing Loudly) that statistical divergence tests can fail to alert under localized, task-relevant shifts. The specific resilience of multi-sensor drift screening against stealthy biases in turbofan degradation analytics has not been systematically characterized.</w:t>
       </w:r>
     </w:p>
     <w:p>
@@ -332,7 +332,7 @@
           <w:i/>
           <w:sz w:val="20"/>
         </w:rPr>
-        <w:t>D. The Research Gap</w:t>
+        <w:t>D. Identified Research Gap</w:t>
       </w:r>
     </w:p>
     <w:p>
@@ -345,7 +345,7 @@
           <w:rFonts w:ascii="Times New Roman" w:hAnsi="Times New Roman"/>
           <w:sz w:val="20"/>
         </w:rPr>
-        <w:t>Prior work exhibits three fundamental shortcomings: (1) Conflated Evaluation Baselines: Benchmark studies routinely publish RMSE comparisons without clarifying whether targets are evaluated on raw physical cycles or piecewise-clipped values, hindering reproducibility. (2) Ignored Censoring Asymmetry in Drift Screening: Standard statistical monitors (KS test, PSI) are commonly applied between training data and live operational data without accounting for survival censoring, leading to unmanageable false-alarm rates. (3) Absence of Unified Security and Prognostic Benchmarking: No existing study jointly quantifies the latency of asymmetric cryptographic verification alongside the stealthiness and late-stage operational risk (HPR, NASA asymmetric score) of sensor-manipulation attacks on standard aviation benchmarks.</w:t>
+        <w:t>Prior literature exhibits three core limitations: (1) Conflation of evaluation baselines (raw vs. clipped ground-truth) without explicit protocol separation; (2) Overlooking survival censoring asymmetry when applying statistical drift detectors across training and operational test data; and (3) An absence of unified evaluations quantifying cryptographic artifact verification overhead alongside sensor-manipulation resilience on standardized aviation benchmarks.</w:t>
       </w:r>
     </w:p>
     <w:p>
@@ -387,7 +387,7 @@
           <w:rFonts w:ascii="Times New Roman" w:hAnsi="Times New Roman"/>
           <w:sz w:val="20"/>
         </w:rPr>
-        <w:t>AeroSentinel operates as a secure ground-side analytics service receiving aircraft engine telemetry packets post-flight or via satellite datalinks. The architecture consists of four modular layers: (1) Cryptographic Ingestion &amp; Lineage Verifier; (2) Input Validation &amp; API Hardening Layer; (3) Dual-Baseline Anomaly &amp; Drift Detector; and (4) HistGradientBoosting RUL Regressor.</w:t>
+        <w:t>AeroSentinel is designed as a ground-side advisory analytics service receiving turbofan telemetry post-flight. The architecture comprises four modular stages: (1) Cryptographic Lineage Verifier; (2) API Input Hardening Layer; (3) Dual-Baseline Covariate Drift Detector; and (4) Gradient-Boosted RUL Regressor.</w:t>
       </w:r>
     </w:p>
     <w:p>
@@ -402,7 +402,7 @@
           <w:i/>
           <w:sz w:val="20"/>
         </w:rPr>
-        <w:t>B. Threat Model &amp; STRIDE Classification</w:t>
+        <w:t>B. Threat Model &amp; Trust Boundaries</w:t>
       </w:r>
     </w:p>
     <w:p>
@@ -415,7 +415,7 @@
           <w:rFonts w:ascii="Times New Roman" w:hAnsi="Times New Roman"/>
           <w:sz w:val="20"/>
         </w:rPr>
-        <w:t>We formulate the threat environment using the STRIDE methodology. We define two distinct threat actors: Adversary A_art operates on the model supply chain with write access to storage or network caches, capable of modifying model weights or manifests but lacking the offline Ed25519 private key. Adversary A_sen intercepts telematics in transit, injecting additive biases (delta in [-2sigma, +2sigma]), ramps, or frozen buffers into sensor streams without modifying true labels.</w:t>
+        <w:t>We model threat actors using the STRIDE methodology: Adversary A_art operates on the model supply chain with write access to storage or network caches, capable of modifying model weights or manifests but lacking the offline Ed25519 private key. Adversary A_sen intercepts telematics in transit, injecting additive biases (delta in [-2.0sigma, +2.0sigma]), creeping ramps, or frozen buffers into sensor streams without modifying true labels.</w:t>
       </w:r>
     </w:p>
     <w:p>
@@ -428,7 +428,7 @@
           <w:rFonts w:ascii="Times New Roman" w:hAnsi="Times New Roman"/>
           <w:sz w:val="20"/>
         </w:rPr>
-        <w:t>The system enforces three core security invariants: (1) Fail-Closed Execution upon signature mismatch or byte tampering; (2) Dual Protocol Separation between raw unclipped and clipped metrics; and (3) Offline Label Isolation ensuring true RUL is never exposed online.</w:t>
+        <w:t>The system enforces three core security invariants: (1) Fail-Closed Execution upon signature mismatch or byte tampering; (2) Dual Protocol Separation between raw unclipped and clipped metrics; and (3) Offline Ground-Truth Isolation ensuring true RUL is never exposed online.</w:t>
       </w:r>
     </w:p>
     <w:p>
@@ -456,7 +456,7 @@
           <w:rFonts w:ascii="Times New Roman" w:hAnsi="Times New Roman"/>
           <w:sz w:val="20"/>
         </w:rPr>
-        <w:t>AeroSentinel adopts the Edwards-curve Digital Signature Algorithm over Curve25519 (Ed25519, RFC 8032) [11], providing 128-bit security with high side-channel resistance. To eliminate serialization ambiguity, the engine enforces RFC 8785 JSON Canonicalization Scheme (JCS) [12]. At initialization, the runtime verifies the Ed25519 signature over the canonical manifest JSON, computes SHA-256 digests of all serialized dependencies (model.joblib, preprocessor.joblib, model_registry.json), and invokes joblib.load if and only if both checks succeed.</w:t>
+        <w:t>AeroSentinel implements the Edwards-curve Digital Signature Algorithm over Curve25519 (Ed25519, RFC 8032) [5]. To prevent signature invalidation caused by dictionary key reordering or whitespace formatting variations, manifest payloads are serialized using the RFC 8785 JSON Canonicalization Scheme (JCS). At initialization, the runtime verifies the Ed25519 signature over canonical JSON, computes SHA-256 digests of all serialized dependencies (best_model.joblib, preprocessor.joblib, model_registry.json), and invokes joblib.load if and only if both checks succeed.</w:t>
       </w:r>
     </w:p>
     <w:p>
@@ -498,7 +498,7 @@
           <w:rFonts w:ascii="Times New Roman" w:hAnsi="Times New Roman"/>
           <w:sz w:val="20"/>
         </w:rPr>
-        <w:t>We evaluate our methodology on NASA C-MAPSS FD001 (100 training engines, 20,631 cycles; 100 test engines, 13,096 cycles; 100 ground-truth terminal RUL values). Seven zero-variance sensors are pruned, retaining 14 active degradation channels: s2, s3, s4, s7, s8, s9, s11, s12, s13, s14, s15, s17, s20, s21. Features include 5-cycle rate-of-change lags, 10-cycle rolling means and standard deviations, RobustScaler normalization, and polynomial interaction terms.</w:t>
+        <w:t>We evaluate our framework on NASA C-MAPSS FD001 (100 training engines, 20,631 cycles; 100 test engines, 13,096 cycles; 100 ground-truth terminal RUL values). Six invariant sensors (s1, s5, s10, s16, s18, s19) and setting 3 are discarded, retaining 15 active degradation channels: s2, s3, s4, s6, s7, s8, s9, s11, s12, s13, s14, s15, s17, s20, s21. The causal feature pipeline constructs 122 features using 5-cycle backward rate-of-change lags, 5- and 15-cycle rolling means and standard deviations, engine baseline drift terms, and StandardScaler normalization fitted strictly on training data.</w:t>
       </w:r>
     </w:p>
     <w:p>
@@ -554,7 +554,7 @@
           <w:rFonts w:ascii="Times New Roman" w:hAnsi="Times New Roman"/>
           <w:sz w:val="20"/>
         </w:rPr>
-        <w:t>To isolate late-stage catastrophic risk, we define the Canonical Hazardous Prediction Rate over the critical subset of test engines whose true remaining life is within 25 cycles (C_25 = {i : y*_i &lt;= 25}, |C_25| = 19 engines in FD001):</w:t>
+        <w:t>To isolate late-stage operational hazards, we evaluate the Canonical Hazardous Prediction Rate over the critical subset of test engines whose true remaining life is within 25 cycles (C_25 = {i : y*_i &lt;= 25}, |C_25| = 19 engines in FD001):</w:t>
       </w:r>
     </w:p>
     <w:p>
@@ -567,7 +567,7 @@
           <w:rFonts w:ascii="Times New Roman" w:hAnsi="Times New Roman"/>
           <w:sz w:val="20"/>
         </w:rPr>
-        <w:t>HPR = (|{i in C_25 : y_hat_i &gt; 25}| / |C_25|) * 100%. Under clean conditions, 3 of 19 engines exceed 25 cycles, yielding HPR_clean = 15.79%. An attack that elevates HPR delays mandatory depot inspection for engines near structural failure.</w:t>
+        <w:t>HPR = (|{i in C_25 : y_hat_i &gt; 25}| / |C_25|) * 100%. Under clean baseline conditions, 3 of 19 engines exceed 25 cycles, yielding HPR_clean = 15.79%. An attack that elevates HPR delays mandatory depot inspection for engines near structural failure.</w:t>
       </w:r>
     </w:p>
     <w:p>
@@ -595,7 +595,7 @@
           <w:rFonts w:ascii="Times New Roman" w:hAnsi="Times New Roman"/>
           <w:sz w:val="20"/>
         </w:rPr>
-        <w:t>Drift is monitored per sensor using the Two-Sample Kolmogorov-Smirnov (KS) test and Population Stability Index (PSI) across 10 quantile bins. We discover that comparing test data directly to training data produces 8 false-positive PSI alert channels on clean data because training engines run to complete failure (100% dead) while test engines are censored. AeroSentinel resolves this via a Dual-Baseline Architecture: model calibration is derived from training data, while operational drift monitoring utilizes an operational test baseline.</w:t>
+        <w:t>Drift is monitored per sensor using the Two-Sample Kolmogorov-Smirnov (KS) test [11] and Population Stability Index (PSI) [10] across 10 quantile bins. We discover that comparing test telemetry directly against training data produces 8 false-positive PSI alert channels on clean data because training engines run to complete failure (100% dead) while test engines are censored. AeroSentinel resolves this via a Dual-Baseline Architecture with disjoint engine partitioning: test engines are partitioned into Calibration Engines 1-50 (uncorrupted reference) and Evaluation Engines 51-100. Evaluating clean Evaluation Engines against Calibration Engines yields 0 PSI alerts and 0 warnings (status: stable), establishing a verified 0.0% False Positive Rate on unseen clean operational data.</w:t>
       </w:r>
     </w:p>
     <w:p>
@@ -623,7 +623,7 @@
           <w:rFonts w:ascii="Times New Roman" w:hAnsi="Times New Roman"/>
           <w:sz w:val="20"/>
         </w:rPr>
-        <w:t>Six deterministic attack scenarios target sensor s11 (HPC static pressure, highest Gini importance): sc1 (Step Bias +1.0σ), sc2 (Step Bias +2.0σ), sc3 (Negative Bias -1.0σ), sc4 (Creeping Linear Ramp +1.5σ), sc5 (Multi-sensor Bias s11 +1.5σ, s4 +1.0σ), and sc6 (Frozen Buffer Replay at cycle 20).</w:t>
+        <w:t>Six deterministic attack scenarios target sensor s11 (HPC static pressure, highest Gini importance): sc1 (Step Bias +1.0σ), sc2 (Step Bias +2.0σ), sc3 (Negative Bias -1.0σ), sc4 (Creeping Linear Ramp +2.0σ), sc5 (Multi-Sensor Bias +1.0σ on s11, s9, s4), and sc6 (Frozen Replay at cycle 40%).</w:t>
       </w:r>
     </w:p>
     <w:p>
@@ -652,7 +652,7 @@
           <w:i/>
           <w:sz w:val="20"/>
         </w:rPr>
-        <w:t>A. Clean Baseline Model Performance &amp; Dual Protocol Separation</w:t>
+        <w:t>A. Clean Baseline Model Performance &amp; Protocol Disambiguation</w:t>
       </w:r>
     </w:p>
     <w:p>
@@ -665,7 +665,7 @@
           <w:rFonts w:ascii="Times New Roman" w:hAnsi="Times New Roman"/>
           <w:sz w:val="20"/>
         </w:rPr>
-        <w:t>Table I details performance across both evaluation protocols on the 100 unseen test engines.</w:t>
+        <w:t>Table I summarizes clean baseline performance across both evaluation protocols on the 100 unseen held-out test engines.</w:t>
       </w:r>
     </w:p>
     <w:tbl>
@@ -1228,7 +1228,7 @@
           <w:rFonts w:ascii="Times New Roman" w:hAnsi="Times New Roman"/>
           <w:sz w:val="20"/>
         </w:rPr>
-        <w:t>Table II presents empirical outcomes across all six sensor attack scenarios.</w:t>
+        <w:t>Table II presents verified empirical outcomes across all six sensor attack scenarios from sensor_attack_results.csv.</w:t>
       </w:r>
     </w:p>
     <w:tbl>
@@ -1270,7 +1270,7 @@
                 <w:color w:val="FFFFFF"/>
                 <w:sz w:val="16"/>
               </w:rPr>
-              <w:t>Scenario</w:t>
+              <w:t>Scenario ID</w:t>
             </w:r>
           </w:p>
         </w:tc>
@@ -1452,7 +1452,7 @@
                 <w:color w:val="FFFFFF"/>
                 <w:sz w:val="16"/>
               </w:rPr>
-              <w:t>PSI Alerts</w:t>
+              <w:t>Disjoint Status</w:t>
             </w:r>
           </w:p>
         </w:tc>
@@ -1478,7 +1478,7 @@
                 <w:rFonts w:ascii="Times New Roman" w:hAnsi="Times New Roman"/>
                 <w:sz w:val="16"/>
               </w:rPr>
-              <w:t>clean</w:t>
+              <w:t>baseline</w:t>
             </w:r>
           </w:p>
         </w:tc>
@@ -1502,7 +1502,7 @@
                 <w:rFonts w:ascii="Times New Roman" w:hAnsi="Times New Roman"/>
                 <w:sz w:val="16"/>
               </w:rPr>
-              <w:t>Clean Baseline</w:t>
+              <w:t>Clean Operational Baseline</w:t>
             </w:r>
           </w:p>
         </w:tc>
@@ -1526,7 +1526,7 @@
                 <w:rFonts w:ascii="Times New Roman" w:hAnsi="Times New Roman"/>
                 <w:sz w:val="16"/>
               </w:rPr>
-              <w:t>0.0</w:t>
+              <w:t>0.00c</w:t>
             </w:r>
           </w:p>
         </w:tc>
@@ -1550,7 +1550,7 @@
                 <w:rFonts w:ascii="Times New Roman" w:hAnsi="Times New Roman"/>
                 <w:sz w:val="16"/>
               </w:rPr>
-              <w:t>13.90</w:t>
+              <w:t>13.9044</w:t>
             </w:r>
           </w:p>
         </w:tc>
@@ -1574,7 +1574,7 @@
                 <w:rFonts w:ascii="Times New Roman" w:hAnsi="Times New Roman"/>
                 <w:sz w:val="16"/>
               </w:rPr>
-              <w:t>10.40</w:t>
+              <w:t>10.4044</w:t>
             </w:r>
           </w:p>
         </w:tc>
@@ -1622,7 +1622,7 @@
                 <w:rFonts w:ascii="Times New Roman" w:hAnsi="Times New Roman"/>
                 <w:sz w:val="16"/>
               </w:rPr>
-              <w:t>15.79</w:t>
+              <w:t>15.79%</w:t>
             </w:r>
           </w:p>
         </w:tc>
@@ -1646,7 +1646,7 @@
                 <w:rFonts w:ascii="Times New Roman" w:hAnsi="Times New Roman"/>
                 <w:sz w:val="16"/>
               </w:rPr>
-              <w:t>0</w:t>
+              <w:t>stable (0 alerts)</w:t>
             </w:r>
           </w:p>
         </w:tc>
@@ -1696,7 +1696,7 @@
                 <w:rFonts w:ascii="Times New Roman" w:hAnsi="Times New Roman"/>
                 <w:sz w:val="16"/>
               </w:rPr>
-              <w:t>Step Bias (+1.0σ)</w:t>
+              <w:t>Step Bias (+1.0σ on S11)</w:t>
             </w:r>
           </w:p>
         </w:tc>
@@ -1720,7 +1720,7 @@
                 <w:rFonts w:ascii="Times New Roman" w:hAnsi="Times New Roman"/>
                 <w:sz w:val="16"/>
               </w:rPr>
-              <w:t>-9.5</w:t>
+              <w:t>-9.52c</w:t>
             </w:r>
           </w:p>
         </w:tc>
@@ -1744,7 +1744,7 @@
                 <w:rFonts w:ascii="Times New Roman" w:hAnsi="Times New Roman"/>
                 <w:sz w:val="16"/>
               </w:rPr>
-              <w:t>15.73</w:t>
+              <w:t>18.1647</w:t>
             </w:r>
           </w:p>
         </w:tc>
@@ -1768,7 +1768,7 @@
                 <w:rFonts w:ascii="Times New Roman" w:hAnsi="Times New Roman"/>
                 <w:sz w:val="16"/>
               </w:rPr>
-              <w:t>13.07</w:t>
+              <w:t>13.5201</w:t>
             </w:r>
           </w:p>
         </w:tc>
@@ -1792,7 +1792,7 @@
                 <w:rFonts w:ascii="Times New Roman" w:hAnsi="Times New Roman"/>
                 <w:sz w:val="16"/>
               </w:rPr>
-              <w:t>254.94</w:t>
+              <w:t>452.46</w:t>
             </w:r>
           </w:p>
         </w:tc>
@@ -1816,7 +1816,7 @@
                 <w:rFonts w:ascii="Times New Roman" w:hAnsi="Times New Roman"/>
                 <w:sz w:val="16"/>
               </w:rPr>
-              <w:t>10.53</w:t>
+              <w:t>5.26%</w:t>
             </w:r>
           </w:p>
         </w:tc>
@@ -1840,7 +1840,7 @@
                 <w:rFonts w:ascii="Times New Roman" w:hAnsi="Times New Roman"/>
                 <w:sz w:val="16"/>
               </w:rPr>
-              <w:t>0</w:t>
+              <w:t>warning (1 alert)</w:t>
             </w:r>
           </w:p>
         </w:tc>
@@ -1890,7 +1890,7 @@
                 <w:rFonts w:ascii="Times New Roman" w:hAnsi="Times New Roman"/>
                 <w:sz w:val="16"/>
               </w:rPr>
-              <w:t>Step Bias (+2.0σ)</w:t>
+              <w:t>Step Bias (+2.0σ on S11)</w:t>
             </w:r>
           </w:p>
         </w:tc>
@@ -1914,7 +1914,7 @@
                 <w:rFonts w:ascii="Times New Roman" w:hAnsi="Times New Roman"/>
                 <w:sz w:val="16"/>
               </w:rPr>
-              <w:t>-12.1</w:t>
+              <w:t>-12.07c</w:t>
             </w:r>
           </w:p>
         </w:tc>
@@ -1938,7 +1938,7 @@
                 <w:rFonts w:ascii="Times New Roman" w:hAnsi="Times New Roman"/>
                 <w:sz w:val="16"/>
               </w:rPr>
-              <w:t>18.06</w:t>
+              <w:t>20.4374</w:t>
             </w:r>
           </w:p>
         </w:tc>
@@ -1962,7 +1962,7 @@
                 <w:rFonts w:ascii="Times New Roman" w:hAnsi="Times New Roman"/>
                 <w:sz w:val="16"/>
               </w:rPr>
-              <w:t>14.88</w:t>
+              <w:t>15.5462</w:t>
             </w:r>
           </w:p>
         </w:tc>
@@ -1986,7 +1986,7 @@
                 <w:rFonts w:ascii="Times New Roman" w:hAnsi="Times New Roman"/>
                 <w:sz w:val="16"/>
               </w:rPr>
-              <w:t>344.24</w:t>
+              <w:t>577.97</w:t>
             </w:r>
           </w:p>
         </w:tc>
@@ -2010,7 +2010,7 @@
                 <w:rFonts w:ascii="Times New Roman" w:hAnsi="Times New Roman"/>
                 <w:sz w:val="16"/>
               </w:rPr>
-              <w:t>5.26</w:t>
+              <w:t>5.26%</w:t>
             </w:r>
           </w:p>
         </w:tc>
@@ -2034,7 +2034,7 @@
                 <w:rFonts w:ascii="Times New Roman" w:hAnsi="Times New Roman"/>
                 <w:sz w:val="16"/>
               </w:rPr>
-              <w:t>1</w:t>
+              <w:t>warning (1 alert)</w:t>
             </w:r>
           </w:p>
         </w:tc>
@@ -2084,7 +2084,7 @@
                 <w:rFonts w:ascii="Times New Roman" w:hAnsi="Times New Roman"/>
                 <w:sz w:val="16"/>
               </w:rPr>
-              <w:t>Negative Bias (-1.0σ)</w:t>
+              <w:t>Negative Bias (-1.0σ on S11)</w:t>
             </w:r>
           </w:p>
         </w:tc>
@@ -2108,7 +2108,7 @@
                 <w:rFonts w:ascii="Times New Roman" w:hAnsi="Times New Roman"/>
                 <w:sz w:val="16"/>
               </w:rPr>
-              <w:t>+5.2</w:t>
+              <w:t>+5.16c</w:t>
             </w:r>
           </w:p>
         </w:tc>
@@ -2132,7 +2132,7 @@
                 <w:rFonts w:ascii="Times New Roman" w:hAnsi="Times New Roman"/>
                 <w:sz w:val="16"/>
               </w:rPr>
-              <w:t>15.02</w:t>
+              <w:t>15.7392</w:t>
             </w:r>
           </w:p>
         </w:tc>
@@ -2156,7 +2156,7 @@
                 <w:rFonts w:ascii="Times New Roman" w:hAnsi="Times New Roman"/>
                 <w:sz w:val="16"/>
               </w:rPr>
-              <w:t>10.49</w:t>
+              <w:t>12.3014</w:t>
             </w:r>
           </w:p>
         </w:tc>
@@ -2180,7 +2180,7 @@
                 <w:rFonts w:ascii="Times New Roman" w:hAnsi="Times New Roman"/>
                 <w:sz w:val="16"/>
               </w:rPr>
-              <w:t>885.24</w:t>
+              <w:t>433.13</w:t>
             </w:r>
           </w:p>
         </w:tc>
@@ -2204,7 +2204,7 @@
                 <w:rFonts w:ascii="Times New Roman" w:hAnsi="Times New Roman"/>
                 <w:sz w:val="16"/>
               </w:rPr>
-              <w:t>31.58</w:t>
+              <w:t>31.58%</w:t>
             </w:r>
           </w:p>
         </w:tc>
@@ -2228,7 +2228,7 @@
                 <w:rFonts w:ascii="Times New Roman" w:hAnsi="Times New Roman"/>
                 <w:sz w:val="16"/>
               </w:rPr>
-              <w:t>0</w:t>
+              <w:t>stable (0 alerts)</w:t>
             </w:r>
           </w:p>
         </w:tc>
@@ -2278,7 +2278,7 @@
                 <w:rFonts w:ascii="Times New Roman" w:hAnsi="Times New Roman"/>
                 <w:sz w:val="16"/>
               </w:rPr>
-              <w:t>Creeping Ramp (+1.5σ)</w:t>
+              <w:t>Creeping Ramp (+2.0σ on S11)</w:t>
             </w:r>
           </w:p>
         </w:tc>
@@ -2302,7 +2302,7 @@
                 <w:rFonts w:ascii="Times New Roman" w:hAnsi="Times New Roman"/>
                 <w:sz w:val="16"/>
               </w:rPr>
-              <w:t>-10.9</w:t>
+              <w:t>-11.74c</w:t>
             </w:r>
           </w:p>
         </w:tc>
@@ -2326,7 +2326,7 @@
                 <w:rFonts w:ascii="Times New Roman" w:hAnsi="Times New Roman"/>
                 <w:sz w:val="16"/>
               </w:rPr>
-              <w:t>17.06</w:t>
+              <w:t>20.1812</w:t>
             </w:r>
           </w:p>
         </w:tc>
@@ -2350,7 +2350,7 @@
                 <w:rFonts w:ascii="Times New Roman" w:hAnsi="Times New Roman"/>
                 <w:sz w:val="16"/>
               </w:rPr>
-              <w:t>13.95</w:t>
+              <w:t>15.3778</w:t>
             </w:r>
           </w:p>
         </w:tc>
@@ -2374,7 +2374,7 @@
                 <w:rFonts w:ascii="Times New Roman" w:hAnsi="Times New Roman"/>
                 <w:sz w:val="16"/>
               </w:rPr>
-              <w:t>274.63</w:t>
+              <w:t>564.54</w:t>
             </w:r>
           </w:p>
         </w:tc>
@@ -2398,7 +2398,7 @@
                 <w:rFonts w:ascii="Times New Roman" w:hAnsi="Times New Roman"/>
                 <w:sz w:val="16"/>
               </w:rPr>
-              <w:t>10.53</w:t>
+              <w:t>5.26%</w:t>
             </w:r>
           </w:p>
         </w:tc>
@@ -2422,7 +2422,7 @@
                 <w:rFonts w:ascii="Times New Roman" w:hAnsi="Times New Roman"/>
                 <w:sz w:val="16"/>
               </w:rPr>
-              <w:t>0</w:t>
+              <w:t>warning (1 alert)</w:t>
             </w:r>
           </w:p>
         </w:tc>
@@ -2472,7 +2472,7 @@
                 <w:rFonts w:ascii="Times New Roman" w:hAnsi="Times New Roman"/>
                 <w:sz w:val="16"/>
               </w:rPr>
-              <w:t>Multi-Sensor Bias</w:t>
+              <w:t>Multi-Sensor Bias (+1.0σ)</w:t>
             </w:r>
           </w:p>
         </w:tc>
@@ -2496,7 +2496,7 @@
                 <w:rFonts w:ascii="Times New Roman" w:hAnsi="Times New Roman"/>
                 <w:sz w:val="16"/>
               </w:rPr>
-              <w:t>-15.0</w:t>
+              <w:t>-21.55c</w:t>
             </w:r>
           </w:p>
         </w:tc>
@@ -2520,7 +2520,7 @@
                 <w:rFonts w:ascii="Times New Roman" w:hAnsi="Times New Roman"/>
                 <w:sz w:val="16"/>
               </w:rPr>
-              <w:t>20.44</w:t>
+              <w:t>28.5856</w:t>
             </w:r>
           </w:p>
         </w:tc>
@@ -2544,7 +2544,7 @@
                 <w:rFonts w:ascii="Times New Roman" w:hAnsi="Times New Roman"/>
                 <w:sz w:val="16"/>
               </w:rPr>
-              <w:t>17.44</w:t>
+              <w:t>21.8959</w:t>
             </w:r>
           </w:p>
         </w:tc>
@@ -2568,7 +2568,7 @@
                 <w:rFonts w:ascii="Times New Roman" w:hAnsi="Times New Roman"/>
                 <w:sz w:val="16"/>
               </w:rPr>
-              <w:t>445.89</w:t>
+              <w:t>1673.13</w:t>
             </w:r>
           </w:p>
         </w:tc>
@@ -2592,7 +2592,7 @@
                 <w:rFonts w:ascii="Times New Roman" w:hAnsi="Times New Roman"/>
                 <w:sz w:val="16"/>
               </w:rPr>
-              <w:t>5.26</w:t>
+              <w:t>0.00%</w:t>
             </w:r>
           </w:p>
         </w:tc>
@@ -2616,7 +2616,7 @@
                 <w:rFonts w:ascii="Times New Roman" w:hAnsi="Times New Roman"/>
                 <w:sz w:val="16"/>
               </w:rPr>
-              <w:t>2</w:t>
+              <w:t>drift_alert (3 alerts)</w:t>
             </w:r>
           </w:p>
         </w:tc>
@@ -2666,7 +2666,7 @@
                 <w:rFonts w:ascii="Times New Roman" w:hAnsi="Times New Roman"/>
                 <w:sz w:val="16"/>
               </w:rPr>
-              <w:t>Frozen Replay (t=20)</w:t>
+              <w:t>Frozen Replay (Cycle 40%)</w:t>
             </w:r>
           </w:p>
         </w:tc>
@@ -2690,7 +2690,7 @@
                 <w:rFonts w:ascii="Times New Roman" w:hAnsi="Times New Roman"/>
                 <w:sz w:val="16"/>
               </w:rPr>
-              <w:t>+41.0</w:t>
+              <w:t>+42.16c</w:t>
             </w:r>
           </w:p>
         </w:tc>
@@ -2714,7 +2714,7 @@
                 <w:rFonts w:ascii="Times New Roman" w:hAnsi="Times New Roman"/>
                 <w:sz w:val="16"/>
               </w:rPr>
-              <w:t>62.33</w:t>
+              <w:t>58.3342</w:t>
             </w:r>
           </w:p>
         </w:tc>
@@ -2738,7 +2738,7 @@
                 <w:rFonts w:ascii="Times New Roman" w:hAnsi="Times New Roman"/>
                 <w:sz w:val="16"/>
               </w:rPr>
-              <w:t>46.12</w:t>
+              <w:t>45.9051</w:t>
             </w:r>
           </w:p>
         </w:tc>
@@ -2762,7 +2762,7 @@
                 <w:rFonts w:ascii="Times New Roman" w:hAnsi="Times New Roman"/>
                 <w:sz w:val="16"/>
               </w:rPr>
-              <w:t>791,878.70</w:t>
+              <w:t>791,878.67</w:t>
             </w:r>
           </w:p>
         </w:tc>
@@ -2786,7 +2786,7 @@
                 <w:rFonts w:ascii="Times New Roman" w:hAnsi="Times New Roman"/>
                 <w:sz w:val="16"/>
               </w:rPr>
-              <w:t>100.00</w:t>
+              <w:t>100.00%</w:t>
             </w:r>
           </w:p>
         </w:tc>
@@ -2810,7 +2810,7 @@
                 <w:rFonts w:ascii="Times New Roman" w:hAnsi="Times New Roman"/>
                 <w:sz w:val="16"/>
               </w:rPr>
-              <w:t>4</w:t>
+              <w:t>drift_alert (3 alerts)</w:t>
             </w:r>
           </w:p>
         </w:tc>
@@ -3051,7 +3051,1021 @@
           <w:rFonts w:ascii="Times New Roman" w:hAnsi="Times New Roman"/>
           <w:sz w:val="20"/>
         </w:rPr>
-        <w:t>Microbenchmarks across N=100 independent trials confirm that pure Ed25519 signature verification requires only 0.11 ± 0.01 ms, contributing less than 0.5% of the total 24.83 ms verified startup latency. Fleet inference for 100 engines executes in 1.47 ms (14.7 µs/engine), and full 14-sensor drift screening executes in 103.23 ms.</w:t>
+        <w:t>Microbenchmarks across N=100 independent trials confirm that pure Ed25519 signature verification requires only 0.13 ± 0.02 ms (median 0.11 ms), contributing less than 0.6% of the total 24.37 ms verified startup latency. Fleet batch inference for 100 engines executes in 1.34 ms (13.4 µs/engine), and full 15-sensor drift screening executes in 100.73 ms.</w:t>
+      </w:r>
+    </w:p>
+    <w:tbl>
+      <w:tblPr>
+        <w:tblW w:type="auto" w:w="0"/>
+        <w:jc w:val="center"/>
+        <w:tblLook w:firstColumn="1" w:firstRow="1" w:lastColumn="0" w:lastRow="0" w:noHBand="0" w:noVBand="1" w:val="04A0"/>
+      </w:tblPr>
+      <w:tblGrid>
+        <w:gridCol w:w="1950"/>
+        <w:gridCol w:w="1950"/>
+        <w:gridCol w:w="1950"/>
+        <w:gridCol w:w="1950"/>
+        <w:gridCol w:w="1950"/>
+      </w:tblGrid>
+      <w:tr>
+        <w:tc>
+          <w:tcPr>
+            <w:tcW w:type="dxa" w:w="1950"/>
+            <w:shd w:fill="1E293B"/>
+            <w:tcMar>
+              <w:top w:w="80" w:type="dxa"/>
+              <w:bottom w:w="80" w:type="dxa"/>
+              <w:left w:w="80" w:type="dxa"/>
+              <w:right w:w="80" w:type="dxa"/>
+            </w:tcMar>
+          </w:tcPr>
+          <w:p>
+            <w:pPr>
+              <w:jc w:val="center"/>
+            </w:pPr>
+            <w:r>
+              <w:rPr>
+                <w:rFonts w:ascii="Times New Roman" w:hAnsi="Times New Roman"/>
+                <w:b/>
+                <w:color w:val="FFFFFF"/>
+                <w:sz w:val="16"/>
+              </w:rPr>
+              <w:t>Pipeline Component</w:t>
+            </w:r>
+          </w:p>
+        </w:tc>
+        <w:tc>
+          <w:tcPr>
+            <w:tcW w:type="dxa" w:w="1950"/>
+            <w:shd w:fill="1E293B"/>
+            <w:tcMar>
+              <w:top w:w="80" w:type="dxa"/>
+              <w:bottom w:w="80" w:type="dxa"/>
+              <w:left w:w="80" w:type="dxa"/>
+              <w:right w:w="80" w:type="dxa"/>
+            </w:tcMar>
+          </w:tcPr>
+          <w:p>
+            <w:pPr>
+              <w:jc w:val="center"/>
+            </w:pPr>
+            <w:r>
+              <w:rPr>
+                <w:rFonts w:ascii="Times New Roman" w:hAnsi="Times New Roman"/>
+                <w:b/>
+                <w:color w:val="FFFFFF"/>
+                <w:sz w:val="16"/>
+              </w:rPr>
+              <w:t>Mean (ms)</w:t>
+            </w:r>
+          </w:p>
+        </w:tc>
+        <w:tc>
+          <w:tcPr>
+            <w:tcW w:type="dxa" w:w="1950"/>
+            <w:shd w:fill="1E293B"/>
+            <w:tcMar>
+              <w:top w:w="80" w:type="dxa"/>
+              <w:bottom w:w="80" w:type="dxa"/>
+              <w:left w:w="80" w:type="dxa"/>
+              <w:right w:w="80" w:type="dxa"/>
+            </w:tcMar>
+          </w:tcPr>
+          <w:p>
+            <w:pPr>
+              <w:jc w:val="center"/>
+            </w:pPr>
+            <w:r>
+              <w:rPr>
+                <w:rFonts w:ascii="Times New Roman" w:hAnsi="Times New Roman"/>
+                <w:b/>
+                <w:color w:val="FFFFFF"/>
+                <w:sz w:val="16"/>
+              </w:rPr>
+              <w:t>Std (ms)</w:t>
+            </w:r>
+          </w:p>
+        </w:tc>
+        <w:tc>
+          <w:tcPr>
+            <w:tcW w:type="dxa" w:w="1950"/>
+            <w:shd w:fill="1E293B"/>
+            <w:tcMar>
+              <w:top w:w="80" w:type="dxa"/>
+              <w:bottom w:w="80" w:type="dxa"/>
+              <w:left w:w="80" w:type="dxa"/>
+              <w:right w:w="80" w:type="dxa"/>
+            </w:tcMar>
+          </w:tcPr>
+          <w:p>
+            <w:pPr>
+              <w:jc w:val="center"/>
+            </w:pPr>
+            <w:r>
+              <w:rPr>
+                <w:rFonts w:ascii="Times New Roman" w:hAnsi="Times New Roman"/>
+                <w:b/>
+                <w:color w:val="FFFFFF"/>
+                <w:sz w:val="16"/>
+              </w:rPr>
+              <w:t>Median (ms)</w:t>
+            </w:r>
+          </w:p>
+        </w:tc>
+        <w:tc>
+          <w:tcPr>
+            <w:tcW w:type="dxa" w:w="1950"/>
+            <w:shd w:fill="1E293B"/>
+            <w:tcMar>
+              <w:top w:w="80" w:type="dxa"/>
+              <w:bottom w:w="80" w:type="dxa"/>
+              <w:left w:w="80" w:type="dxa"/>
+              <w:right w:w="80" w:type="dxa"/>
+            </w:tcMar>
+          </w:tcPr>
+          <w:p>
+            <w:pPr>
+              <w:jc w:val="center"/>
+            </w:pPr>
+            <w:r>
+              <w:rPr>
+                <w:rFonts w:ascii="Times New Roman" w:hAnsi="Times New Roman"/>
+                <w:b/>
+                <w:color w:val="FFFFFF"/>
+                <w:sz w:val="16"/>
+              </w:rPr>
+              <w:t>p95 (ms)</w:t>
+            </w:r>
+          </w:p>
+        </w:tc>
+      </w:tr>
+      <w:tr>
+        <w:tc>
+          <w:tcPr>
+            <w:tcW w:type="dxa" w:w="1950"/>
+            <w:shd w:fill="F8FAFC"/>
+            <w:tcMar>
+              <w:top w:w="50" w:type="dxa"/>
+              <w:bottom w:w="50" w:type="dxa"/>
+              <w:left w:w="80" w:type="dxa"/>
+              <w:right w:w="80" w:type="dxa"/>
+            </w:tcMar>
+          </w:tcPr>
+          <w:p>
+            <w:pPr>
+              <w:jc w:val="center"/>
+            </w:pPr>
+            <w:r>
+              <w:rPr>
+                <w:rFonts w:ascii="Times New Roman" w:hAnsi="Times New Roman"/>
+                <w:sz w:val="16"/>
+              </w:rPr>
+              <w:t>Ed25519 Signature Verification</w:t>
+            </w:r>
+          </w:p>
+        </w:tc>
+        <w:tc>
+          <w:tcPr>
+            <w:tcW w:type="dxa" w:w="1950"/>
+            <w:shd w:fill="F8FAFC"/>
+            <w:tcMar>
+              <w:top w:w="50" w:type="dxa"/>
+              <w:bottom w:w="50" w:type="dxa"/>
+              <w:left w:w="80" w:type="dxa"/>
+              <w:right w:w="80" w:type="dxa"/>
+            </w:tcMar>
+          </w:tcPr>
+          <w:p>
+            <w:pPr>
+              <w:jc w:val="center"/>
+            </w:pPr>
+            <w:r>
+              <w:rPr>
+                <w:rFonts w:ascii="Times New Roman" w:hAnsi="Times New Roman"/>
+                <w:sz w:val="16"/>
+              </w:rPr>
+              <w:t>0.13</w:t>
+            </w:r>
+          </w:p>
+        </w:tc>
+        <w:tc>
+          <w:tcPr>
+            <w:tcW w:type="dxa" w:w="1950"/>
+            <w:shd w:fill="F8FAFC"/>
+            <w:tcMar>
+              <w:top w:w="50" w:type="dxa"/>
+              <w:bottom w:w="50" w:type="dxa"/>
+              <w:left w:w="80" w:type="dxa"/>
+              <w:right w:w="80" w:type="dxa"/>
+            </w:tcMar>
+          </w:tcPr>
+          <w:p>
+            <w:pPr>
+              <w:jc w:val="center"/>
+            </w:pPr>
+            <w:r>
+              <w:rPr>
+                <w:rFonts w:ascii="Times New Roman" w:hAnsi="Times New Roman"/>
+                <w:sz w:val="16"/>
+              </w:rPr>
+              <w:t>0.02</w:t>
+            </w:r>
+          </w:p>
+        </w:tc>
+        <w:tc>
+          <w:tcPr>
+            <w:tcW w:type="dxa" w:w="1950"/>
+            <w:shd w:fill="F8FAFC"/>
+            <w:tcMar>
+              <w:top w:w="50" w:type="dxa"/>
+              <w:bottom w:w="50" w:type="dxa"/>
+              <w:left w:w="80" w:type="dxa"/>
+              <w:right w:w="80" w:type="dxa"/>
+            </w:tcMar>
+          </w:tcPr>
+          <w:p>
+            <w:pPr>
+              <w:jc w:val="center"/>
+            </w:pPr>
+            <w:r>
+              <w:rPr>
+                <w:rFonts w:ascii="Times New Roman" w:hAnsi="Times New Roman"/>
+                <w:sz w:val="16"/>
+              </w:rPr>
+              <w:t>0.11</w:t>
+            </w:r>
+          </w:p>
+        </w:tc>
+        <w:tc>
+          <w:tcPr>
+            <w:tcW w:type="dxa" w:w="1950"/>
+            <w:shd w:fill="F8FAFC"/>
+            <w:tcMar>
+              <w:top w:w="50" w:type="dxa"/>
+              <w:bottom w:w="50" w:type="dxa"/>
+              <w:left w:w="80" w:type="dxa"/>
+              <w:right w:w="80" w:type="dxa"/>
+            </w:tcMar>
+          </w:tcPr>
+          <w:p>
+            <w:pPr>
+              <w:jc w:val="center"/>
+            </w:pPr>
+            <w:r>
+              <w:rPr>
+                <w:rFonts w:ascii="Times New Roman" w:hAnsi="Times New Roman"/>
+                <w:sz w:val="16"/>
+              </w:rPr>
+              <w:t>0.25</w:t>
+            </w:r>
+          </w:p>
+        </w:tc>
+      </w:tr>
+      <w:tr>
+        <w:tc>
+          <w:tcPr>
+            <w:tcW w:type="dxa" w:w="1950"/>
+            <w:shd w:fill="FFFFFF"/>
+            <w:tcMar>
+              <w:top w:w="50" w:type="dxa"/>
+              <w:bottom w:w="50" w:type="dxa"/>
+              <w:left w:w="80" w:type="dxa"/>
+              <w:right w:w="80" w:type="dxa"/>
+            </w:tcMar>
+          </w:tcPr>
+          <w:p>
+            <w:pPr>
+              <w:jc w:val="center"/>
+            </w:pPr>
+            <w:r>
+              <w:rPr>
+                <w:rFonts w:ascii="Times New Roman" w:hAnsi="Times New Roman"/>
+                <w:sz w:val="16"/>
+              </w:rPr>
+              <w:t>Multi-File SHA-256 Hashing (~20 MB)</w:t>
+            </w:r>
+          </w:p>
+        </w:tc>
+        <w:tc>
+          <w:tcPr>
+            <w:tcW w:type="dxa" w:w="1950"/>
+            <w:shd w:fill="FFFFFF"/>
+            <w:tcMar>
+              <w:top w:w="50" w:type="dxa"/>
+              <w:bottom w:w="50" w:type="dxa"/>
+              <w:left w:w="80" w:type="dxa"/>
+              <w:right w:w="80" w:type="dxa"/>
+            </w:tcMar>
+          </w:tcPr>
+          <w:p>
+            <w:pPr>
+              <w:jc w:val="center"/>
+            </w:pPr>
+            <w:r>
+              <w:rPr>
+                <w:rFonts w:ascii="Times New Roman" w:hAnsi="Times New Roman"/>
+                <w:sz w:val="16"/>
+              </w:rPr>
+              <w:t>14.93</w:t>
+            </w:r>
+          </w:p>
+        </w:tc>
+        <w:tc>
+          <w:tcPr>
+            <w:tcW w:type="dxa" w:w="1950"/>
+            <w:shd w:fill="FFFFFF"/>
+            <w:tcMar>
+              <w:top w:w="50" w:type="dxa"/>
+              <w:bottom w:w="50" w:type="dxa"/>
+              <w:left w:w="80" w:type="dxa"/>
+              <w:right w:w="80" w:type="dxa"/>
+            </w:tcMar>
+          </w:tcPr>
+          <w:p>
+            <w:pPr>
+              <w:jc w:val="center"/>
+            </w:pPr>
+            <w:r>
+              <w:rPr>
+                <w:rFonts w:ascii="Times New Roman" w:hAnsi="Times New Roman"/>
+                <w:sz w:val="16"/>
+              </w:rPr>
+              <w:t>0.82</w:t>
+            </w:r>
+          </w:p>
+        </w:tc>
+        <w:tc>
+          <w:tcPr>
+            <w:tcW w:type="dxa" w:w="1950"/>
+            <w:shd w:fill="FFFFFF"/>
+            <w:tcMar>
+              <w:top w:w="50" w:type="dxa"/>
+              <w:bottom w:w="50" w:type="dxa"/>
+              <w:left w:w="80" w:type="dxa"/>
+              <w:right w:w="80" w:type="dxa"/>
+            </w:tcMar>
+          </w:tcPr>
+          <w:p>
+            <w:pPr>
+              <w:jc w:val="center"/>
+            </w:pPr>
+            <w:r>
+              <w:rPr>
+                <w:rFonts w:ascii="Times New Roman" w:hAnsi="Times New Roman"/>
+                <w:sz w:val="16"/>
+              </w:rPr>
+              <w:t>14.77</w:t>
+            </w:r>
+          </w:p>
+        </w:tc>
+        <w:tc>
+          <w:tcPr>
+            <w:tcW w:type="dxa" w:w="1950"/>
+            <w:shd w:fill="FFFFFF"/>
+            <w:tcMar>
+              <w:top w:w="50" w:type="dxa"/>
+              <w:bottom w:w="50" w:type="dxa"/>
+              <w:left w:w="80" w:type="dxa"/>
+              <w:right w:w="80" w:type="dxa"/>
+            </w:tcMar>
+          </w:tcPr>
+          <w:p>
+            <w:pPr>
+              <w:jc w:val="center"/>
+            </w:pPr>
+            <w:r>
+              <w:rPr>
+                <w:rFonts w:ascii="Times New Roman" w:hAnsi="Times New Roman"/>
+                <w:sz w:val="16"/>
+              </w:rPr>
+              <w:t>16.40</w:t>
+            </w:r>
+          </w:p>
+        </w:tc>
+      </w:tr>
+      <w:tr>
+        <w:tc>
+          <w:tcPr>
+            <w:tcW w:type="dxa" w:w="1950"/>
+            <w:shd w:fill="F8FAFC"/>
+            <w:tcMar>
+              <w:top w:w="50" w:type="dxa"/>
+              <w:bottom w:w="50" w:type="dxa"/>
+              <w:left w:w="80" w:type="dxa"/>
+              <w:right w:w="80" w:type="dxa"/>
+            </w:tcMar>
+          </w:tcPr>
+          <w:p>
+            <w:pPr>
+              <w:jc w:val="center"/>
+            </w:pPr>
+            <w:r>
+              <w:rPr>
+                <w:rFonts w:ascii="Times New Roman" w:hAnsi="Times New Roman"/>
+                <w:sz w:val="16"/>
+              </w:rPr>
+              <w:t>Model Deserialization (joblib.load)</w:t>
+            </w:r>
+          </w:p>
+        </w:tc>
+        <w:tc>
+          <w:tcPr>
+            <w:tcW w:type="dxa" w:w="1950"/>
+            <w:shd w:fill="F8FAFC"/>
+            <w:tcMar>
+              <w:top w:w="50" w:type="dxa"/>
+              <w:bottom w:w="50" w:type="dxa"/>
+              <w:left w:w="80" w:type="dxa"/>
+              <w:right w:w="80" w:type="dxa"/>
+            </w:tcMar>
+          </w:tcPr>
+          <w:p>
+            <w:pPr>
+              <w:jc w:val="center"/>
+            </w:pPr>
+            <w:r>
+              <w:rPr>
+                <w:rFonts w:ascii="Times New Roman" w:hAnsi="Times New Roman"/>
+                <w:sz w:val="16"/>
+              </w:rPr>
+              <w:t>9.47</w:t>
+            </w:r>
+          </w:p>
+        </w:tc>
+        <w:tc>
+          <w:tcPr>
+            <w:tcW w:type="dxa" w:w="1950"/>
+            <w:shd w:fill="F8FAFC"/>
+            <w:tcMar>
+              <w:top w:w="50" w:type="dxa"/>
+              <w:bottom w:w="50" w:type="dxa"/>
+              <w:left w:w="80" w:type="dxa"/>
+              <w:right w:w="80" w:type="dxa"/>
+            </w:tcMar>
+          </w:tcPr>
+          <w:p>
+            <w:pPr>
+              <w:jc w:val="center"/>
+            </w:pPr>
+            <w:r>
+              <w:rPr>
+                <w:rFonts w:ascii="Times New Roman" w:hAnsi="Times New Roman"/>
+                <w:sz w:val="16"/>
+              </w:rPr>
+              <w:t>1.96</w:t>
+            </w:r>
+          </w:p>
+        </w:tc>
+        <w:tc>
+          <w:tcPr>
+            <w:tcW w:type="dxa" w:w="1950"/>
+            <w:shd w:fill="F8FAFC"/>
+            <w:tcMar>
+              <w:top w:w="50" w:type="dxa"/>
+              <w:bottom w:w="50" w:type="dxa"/>
+              <w:left w:w="80" w:type="dxa"/>
+              <w:right w:w="80" w:type="dxa"/>
+            </w:tcMar>
+          </w:tcPr>
+          <w:p>
+            <w:pPr>
+              <w:jc w:val="center"/>
+            </w:pPr>
+            <w:r>
+              <w:rPr>
+                <w:rFonts w:ascii="Times New Roman" w:hAnsi="Times New Roman"/>
+                <w:sz w:val="16"/>
+              </w:rPr>
+              <w:t>8.65</w:t>
+            </w:r>
+          </w:p>
+        </w:tc>
+        <w:tc>
+          <w:tcPr>
+            <w:tcW w:type="dxa" w:w="1950"/>
+            <w:shd w:fill="F8FAFC"/>
+            <w:tcMar>
+              <w:top w:w="50" w:type="dxa"/>
+              <w:bottom w:w="50" w:type="dxa"/>
+              <w:left w:w="80" w:type="dxa"/>
+              <w:right w:w="80" w:type="dxa"/>
+            </w:tcMar>
+          </w:tcPr>
+          <w:p>
+            <w:pPr>
+              <w:jc w:val="center"/>
+            </w:pPr>
+            <w:r>
+              <w:rPr>
+                <w:rFonts w:ascii="Times New Roman" w:hAnsi="Times New Roman"/>
+                <w:sz w:val="16"/>
+              </w:rPr>
+              <w:t>14.32</w:t>
+            </w:r>
+          </w:p>
+        </w:tc>
+      </w:tr>
+      <w:tr>
+        <w:tc>
+          <w:tcPr>
+            <w:tcW w:type="dxa" w:w="1950"/>
+            <w:shd w:fill="FFFFFF"/>
+            <w:tcMar>
+              <w:top w:w="50" w:type="dxa"/>
+              <w:bottom w:w="50" w:type="dxa"/>
+              <w:left w:w="80" w:type="dxa"/>
+              <w:right w:w="80" w:type="dxa"/>
+            </w:tcMar>
+          </w:tcPr>
+          <w:p>
+            <w:pPr>
+              <w:jc w:val="center"/>
+            </w:pPr>
+            <w:r>
+              <w:rPr>
+                <w:rFonts w:ascii="Times New Roman" w:hAnsi="Times New Roman"/>
+                <w:sz w:val="16"/>
+              </w:rPr>
+              <w:t>Total Verified Startup Pipeline</w:t>
+            </w:r>
+          </w:p>
+        </w:tc>
+        <w:tc>
+          <w:tcPr>
+            <w:tcW w:type="dxa" w:w="1950"/>
+            <w:shd w:fill="FFFFFF"/>
+            <w:tcMar>
+              <w:top w:w="50" w:type="dxa"/>
+              <w:bottom w:w="50" w:type="dxa"/>
+              <w:left w:w="80" w:type="dxa"/>
+              <w:right w:w="80" w:type="dxa"/>
+            </w:tcMar>
+          </w:tcPr>
+          <w:p>
+            <w:pPr>
+              <w:jc w:val="center"/>
+            </w:pPr>
+            <w:r>
+              <w:rPr>
+                <w:rFonts w:ascii="Times New Roman" w:hAnsi="Times New Roman"/>
+                <w:sz w:val="16"/>
+              </w:rPr>
+              <w:t>24.37</w:t>
+            </w:r>
+          </w:p>
+        </w:tc>
+        <w:tc>
+          <w:tcPr>
+            <w:tcW w:type="dxa" w:w="1950"/>
+            <w:shd w:fill="FFFFFF"/>
+            <w:tcMar>
+              <w:top w:w="50" w:type="dxa"/>
+              <w:bottom w:w="50" w:type="dxa"/>
+              <w:left w:w="80" w:type="dxa"/>
+              <w:right w:w="80" w:type="dxa"/>
+            </w:tcMar>
+          </w:tcPr>
+          <w:p>
+            <w:pPr>
+              <w:jc w:val="center"/>
+            </w:pPr>
+            <w:r>
+              <w:rPr>
+                <w:rFonts w:ascii="Times New Roman" w:hAnsi="Times New Roman"/>
+                <w:sz w:val="16"/>
+              </w:rPr>
+              <w:t>1.45</w:t>
+            </w:r>
+          </w:p>
+        </w:tc>
+        <w:tc>
+          <w:tcPr>
+            <w:tcW w:type="dxa" w:w="1950"/>
+            <w:shd w:fill="FFFFFF"/>
+            <w:tcMar>
+              <w:top w:w="50" w:type="dxa"/>
+              <w:bottom w:w="50" w:type="dxa"/>
+              <w:left w:w="80" w:type="dxa"/>
+              <w:right w:w="80" w:type="dxa"/>
+            </w:tcMar>
+          </w:tcPr>
+          <w:p>
+            <w:pPr>
+              <w:jc w:val="center"/>
+            </w:pPr>
+            <w:r>
+              <w:rPr>
+                <w:rFonts w:ascii="Times New Roman" w:hAnsi="Times New Roman"/>
+                <w:sz w:val="16"/>
+              </w:rPr>
+              <w:t>23.90</w:t>
+            </w:r>
+          </w:p>
+        </w:tc>
+        <w:tc>
+          <w:tcPr>
+            <w:tcW w:type="dxa" w:w="1950"/>
+            <w:shd w:fill="FFFFFF"/>
+            <w:tcMar>
+              <w:top w:w="50" w:type="dxa"/>
+              <w:bottom w:w="50" w:type="dxa"/>
+              <w:left w:w="80" w:type="dxa"/>
+              <w:right w:w="80" w:type="dxa"/>
+            </w:tcMar>
+          </w:tcPr>
+          <w:p>
+            <w:pPr>
+              <w:jc w:val="center"/>
+            </w:pPr>
+            <w:r>
+              <w:rPr>
+                <w:rFonts w:ascii="Times New Roman" w:hAnsi="Times New Roman"/>
+                <w:sz w:val="16"/>
+              </w:rPr>
+              <w:t>26.71</w:t>
+            </w:r>
+          </w:p>
+        </w:tc>
+      </w:tr>
+      <w:tr>
+        <w:tc>
+          <w:tcPr>
+            <w:tcW w:type="dxa" w:w="1950"/>
+            <w:shd w:fill="F8FAFC"/>
+            <w:tcMar>
+              <w:top w:w="50" w:type="dxa"/>
+              <w:bottom w:w="50" w:type="dxa"/>
+              <w:left w:w="80" w:type="dxa"/>
+              <w:right w:w="80" w:type="dxa"/>
+            </w:tcMar>
+          </w:tcPr>
+          <w:p>
+            <w:pPr>
+              <w:jc w:val="center"/>
+            </w:pPr>
+            <w:r>
+              <w:rPr>
+                <w:rFonts w:ascii="Times New Roman" w:hAnsi="Times New Roman"/>
+                <w:sz w:val="16"/>
+              </w:rPr>
+              <w:t>Single-Engine Inference (1x122)</w:t>
+            </w:r>
+          </w:p>
+        </w:tc>
+        <w:tc>
+          <w:tcPr>
+            <w:tcW w:type="dxa" w:w="1950"/>
+            <w:shd w:fill="F8FAFC"/>
+            <w:tcMar>
+              <w:top w:w="50" w:type="dxa"/>
+              <w:bottom w:w="50" w:type="dxa"/>
+              <w:left w:w="80" w:type="dxa"/>
+              <w:right w:w="80" w:type="dxa"/>
+            </w:tcMar>
+          </w:tcPr>
+          <w:p>
+            <w:pPr>
+              <w:jc w:val="center"/>
+            </w:pPr>
+            <w:r>
+              <w:rPr>
+                <w:rFonts w:ascii="Times New Roman" w:hAnsi="Times New Roman"/>
+                <w:sz w:val="16"/>
+              </w:rPr>
+              <w:t>1.39</w:t>
+            </w:r>
+          </w:p>
+        </w:tc>
+        <w:tc>
+          <w:tcPr>
+            <w:tcW w:type="dxa" w:w="1950"/>
+            <w:shd w:fill="F8FAFC"/>
+            <w:tcMar>
+              <w:top w:w="50" w:type="dxa"/>
+              <w:bottom w:w="50" w:type="dxa"/>
+              <w:left w:w="80" w:type="dxa"/>
+              <w:right w:w="80" w:type="dxa"/>
+            </w:tcMar>
+          </w:tcPr>
+          <w:p>
+            <w:pPr>
+              <w:jc w:val="center"/>
+            </w:pPr>
+            <w:r>
+              <w:rPr>
+                <w:rFonts w:ascii="Times New Roman" w:hAnsi="Times New Roman"/>
+                <w:sz w:val="16"/>
+              </w:rPr>
+              <w:t>0.44</w:t>
+            </w:r>
+          </w:p>
+        </w:tc>
+        <w:tc>
+          <w:tcPr>
+            <w:tcW w:type="dxa" w:w="1950"/>
+            <w:shd w:fill="F8FAFC"/>
+            <w:tcMar>
+              <w:top w:w="50" w:type="dxa"/>
+              <w:bottom w:w="50" w:type="dxa"/>
+              <w:left w:w="80" w:type="dxa"/>
+              <w:right w:w="80" w:type="dxa"/>
+            </w:tcMar>
+          </w:tcPr>
+          <w:p>
+            <w:pPr>
+              <w:jc w:val="center"/>
+            </w:pPr>
+            <w:r>
+              <w:rPr>
+                <w:rFonts w:ascii="Times New Roman" w:hAnsi="Times New Roman"/>
+                <w:sz w:val="16"/>
+              </w:rPr>
+              <w:t>1.16</w:t>
+            </w:r>
+          </w:p>
+        </w:tc>
+        <w:tc>
+          <w:tcPr>
+            <w:tcW w:type="dxa" w:w="1950"/>
+            <w:shd w:fill="F8FAFC"/>
+            <w:tcMar>
+              <w:top w:w="50" w:type="dxa"/>
+              <w:bottom w:w="50" w:type="dxa"/>
+              <w:left w:w="80" w:type="dxa"/>
+              <w:right w:w="80" w:type="dxa"/>
+            </w:tcMar>
+          </w:tcPr>
+          <w:p>
+            <w:pPr>
+              <w:jc w:val="center"/>
+            </w:pPr>
+            <w:r>
+              <w:rPr>
+                <w:rFonts w:ascii="Times New Roman" w:hAnsi="Times New Roman"/>
+                <w:sz w:val="16"/>
+              </w:rPr>
+              <w:t>2.43</w:t>
+            </w:r>
+          </w:p>
+        </w:tc>
+      </w:tr>
+      <w:tr>
+        <w:tc>
+          <w:tcPr>
+            <w:tcW w:type="dxa" w:w="1950"/>
+            <w:shd w:fill="FFFFFF"/>
+            <w:tcMar>
+              <w:top w:w="50" w:type="dxa"/>
+              <w:bottom w:w="50" w:type="dxa"/>
+              <w:left w:w="80" w:type="dxa"/>
+              <w:right w:w="80" w:type="dxa"/>
+            </w:tcMar>
+          </w:tcPr>
+          <w:p>
+            <w:pPr>
+              <w:jc w:val="center"/>
+            </w:pPr>
+            <w:r>
+              <w:rPr>
+                <w:rFonts w:ascii="Times New Roman" w:hAnsi="Times New Roman"/>
+                <w:sz w:val="16"/>
+              </w:rPr>
+              <w:t>Fleet Batch Inference (100x122)</w:t>
+            </w:r>
+          </w:p>
+        </w:tc>
+        <w:tc>
+          <w:tcPr>
+            <w:tcW w:type="dxa" w:w="1950"/>
+            <w:shd w:fill="FFFFFF"/>
+            <w:tcMar>
+              <w:top w:w="50" w:type="dxa"/>
+              <w:bottom w:w="50" w:type="dxa"/>
+              <w:left w:w="80" w:type="dxa"/>
+              <w:right w:w="80" w:type="dxa"/>
+            </w:tcMar>
+          </w:tcPr>
+          <w:p>
+            <w:pPr>
+              <w:jc w:val="center"/>
+            </w:pPr>
+            <w:r>
+              <w:rPr>
+                <w:rFonts w:ascii="Times New Roman" w:hAnsi="Times New Roman"/>
+                <w:sz w:val="16"/>
+              </w:rPr>
+              <w:t>1.34</w:t>
+            </w:r>
+          </w:p>
+        </w:tc>
+        <w:tc>
+          <w:tcPr>
+            <w:tcW w:type="dxa" w:w="1950"/>
+            <w:shd w:fill="FFFFFF"/>
+            <w:tcMar>
+              <w:top w:w="50" w:type="dxa"/>
+              <w:bottom w:w="50" w:type="dxa"/>
+              <w:left w:w="80" w:type="dxa"/>
+              <w:right w:w="80" w:type="dxa"/>
+            </w:tcMar>
+          </w:tcPr>
+          <w:p>
+            <w:pPr>
+              <w:jc w:val="center"/>
+            </w:pPr>
+            <w:r>
+              <w:rPr>
+                <w:rFonts w:ascii="Times New Roman" w:hAnsi="Times New Roman"/>
+                <w:sz w:val="16"/>
+              </w:rPr>
+              <w:t>0.32</w:t>
+            </w:r>
+          </w:p>
+        </w:tc>
+        <w:tc>
+          <w:tcPr>
+            <w:tcW w:type="dxa" w:w="1950"/>
+            <w:shd w:fill="FFFFFF"/>
+            <w:tcMar>
+              <w:top w:w="50" w:type="dxa"/>
+              <w:bottom w:w="50" w:type="dxa"/>
+              <w:left w:w="80" w:type="dxa"/>
+              <w:right w:w="80" w:type="dxa"/>
+            </w:tcMar>
+          </w:tcPr>
+          <w:p>
+            <w:pPr>
+              <w:jc w:val="center"/>
+            </w:pPr>
+            <w:r>
+              <w:rPr>
+                <w:rFonts w:ascii="Times New Roman" w:hAnsi="Times New Roman"/>
+                <w:sz w:val="16"/>
+              </w:rPr>
+              <w:t>1.17</w:t>
+            </w:r>
+          </w:p>
+        </w:tc>
+        <w:tc>
+          <w:tcPr>
+            <w:tcW w:type="dxa" w:w="1950"/>
+            <w:shd w:fill="FFFFFF"/>
+            <w:tcMar>
+              <w:top w:w="50" w:type="dxa"/>
+              <w:bottom w:w="50" w:type="dxa"/>
+              <w:left w:w="80" w:type="dxa"/>
+              <w:right w:w="80" w:type="dxa"/>
+            </w:tcMar>
+          </w:tcPr>
+          <w:p>
+            <w:pPr>
+              <w:jc w:val="center"/>
+            </w:pPr>
+            <w:r>
+              <w:rPr>
+                <w:rFonts w:ascii="Times New Roman" w:hAnsi="Times New Roman"/>
+                <w:sz w:val="16"/>
+              </w:rPr>
+              <w:t>2.11</w:t>
+            </w:r>
+          </w:p>
+        </w:tc>
+      </w:tr>
+      <w:tr>
+        <w:tc>
+          <w:tcPr>
+            <w:tcW w:type="dxa" w:w="1950"/>
+            <w:shd w:fill="F8FAFC"/>
+            <w:tcMar>
+              <w:top w:w="50" w:type="dxa"/>
+              <w:bottom w:w="50" w:type="dxa"/>
+              <w:left w:w="80" w:type="dxa"/>
+              <w:right w:w="80" w:type="dxa"/>
+            </w:tcMar>
+          </w:tcPr>
+          <w:p>
+            <w:pPr>
+              <w:jc w:val="center"/>
+            </w:pPr>
+            <w:r>
+              <w:rPr>
+                <w:rFonts w:ascii="Times New Roman" w:hAnsi="Times New Roman"/>
+                <w:sz w:val="16"/>
+              </w:rPr>
+              <w:t>15-Sensor KS + PSI Drift Screening</w:t>
+            </w:r>
+          </w:p>
+        </w:tc>
+        <w:tc>
+          <w:tcPr>
+            <w:tcW w:type="dxa" w:w="1950"/>
+            <w:shd w:fill="F8FAFC"/>
+            <w:tcMar>
+              <w:top w:w="50" w:type="dxa"/>
+              <w:bottom w:w="50" w:type="dxa"/>
+              <w:left w:w="80" w:type="dxa"/>
+              <w:right w:w="80" w:type="dxa"/>
+            </w:tcMar>
+          </w:tcPr>
+          <w:p>
+            <w:pPr>
+              <w:jc w:val="center"/>
+            </w:pPr>
+            <w:r>
+              <w:rPr>
+                <w:rFonts w:ascii="Times New Roman" w:hAnsi="Times New Roman"/>
+                <w:sz w:val="16"/>
+              </w:rPr>
+              <w:t>100.73</w:t>
+            </w:r>
+          </w:p>
+        </w:tc>
+        <w:tc>
+          <w:tcPr>
+            <w:tcW w:type="dxa" w:w="1950"/>
+            <w:shd w:fill="F8FAFC"/>
+            <w:tcMar>
+              <w:top w:w="50" w:type="dxa"/>
+              <w:bottom w:w="50" w:type="dxa"/>
+              <w:left w:w="80" w:type="dxa"/>
+              <w:right w:w="80" w:type="dxa"/>
+            </w:tcMar>
+          </w:tcPr>
+          <w:p>
+            <w:pPr>
+              <w:jc w:val="center"/>
+            </w:pPr>
+            <w:r>
+              <w:rPr>
+                <w:rFonts w:ascii="Times New Roman" w:hAnsi="Times New Roman"/>
+                <w:sz w:val="16"/>
+              </w:rPr>
+              <w:t>2.56</w:t>
+            </w:r>
+          </w:p>
+        </w:tc>
+        <w:tc>
+          <w:tcPr>
+            <w:tcW w:type="dxa" w:w="1950"/>
+            <w:shd w:fill="F8FAFC"/>
+            <w:tcMar>
+              <w:top w:w="50" w:type="dxa"/>
+              <w:bottom w:w="50" w:type="dxa"/>
+              <w:left w:w="80" w:type="dxa"/>
+              <w:right w:w="80" w:type="dxa"/>
+            </w:tcMar>
+          </w:tcPr>
+          <w:p>
+            <w:pPr>
+              <w:jc w:val="center"/>
+            </w:pPr>
+            <w:r>
+              <w:rPr>
+                <w:rFonts w:ascii="Times New Roman" w:hAnsi="Times New Roman"/>
+                <w:sz w:val="16"/>
+              </w:rPr>
+              <w:t>100.29</w:t>
+            </w:r>
+          </w:p>
+        </w:tc>
+        <w:tc>
+          <w:tcPr>
+            <w:tcW w:type="dxa" w:w="1950"/>
+            <w:shd w:fill="F8FAFC"/>
+            <w:tcMar>
+              <w:top w:w="50" w:type="dxa"/>
+              <w:bottom w:w="50" w:type="dxa"/>
+              <w:left w:w="80" w:type="dxa"/>
+              <w:right w:w="80" w:type="dxa"/>
+            </w:tcMar>
+          </w:tcPr>
+          <w:p>
+            <w:pPr>
+              <w:jc w:val="center"/>
+            </w:pPr>
+            <w:r>
+              <w:rPr>
+                <w:rFonts w:ascii="Times New Roman" w:hAnsi="Times New Roman"/>
+                <w:sz w:val="16"/>
+              </w:rPr>
+              <w:t>105.32</w:t>
+            </w:r>
+          </w:p>
+        </w:tc>
+      </w:tr>
+    </w:tbl>
+    <w:p>
+      <w:pPr>
+        <w:spacing w:before="80" w:after="160"/>
+        <w:jc w:val="center"/>
+      </w:pPr>
+      <w:r>
+        <w:rPr>
+          <w:rFonts w:ascii="Times New Roman" w:hAnsi="Times New Roman"/>
+          <w:b/>
+          <w:sz w:val="17"/>
+        </w:rPr>
+        <w:t>TABLE IV: Computational Latency Benchmarks Across Pipeline Stages (N = 100 Repetitions)</w:t>
       </w:r>
     </w:p>
     <w:p>
@@ -3121,7 +4135,7 @@
           <w:b/>
           <w:sz w:val="22"/>
         </w:rPr>
-        <w:t>VI. DISCUSSION &amp; THREATS TO VALIDITY</w:t>
+        <w:t>VI. DISCUSSION, THREATS TO VALIDITY &amp; LIMITATIONS</w:t>
       </w:r>
     </w:p>
     <w:p>
@@ -3134,7 +4148,7 @@
           <w:rFonts w:ascii="Times New Roman" w:hAnsi="Times New Roman"/>
           <w:sz w:val="20"/>
         </w:rPr>
-        <w:t>Our findings illustrate that statistical anomaly detectors tuned for wide operational fleet tolerances exhibit inherent blind spots against stealthy perturbations. Adversaries can induce severe hazardous delays (doubling HPR) without crossing PSI alert thresholds. Consequently, predictive maintenance security requires end-to-end cryptographic integrity controls in tandem with physics-informed invariant checking.</w:t>
+        <w:t>Our findings illustrate that statistical anomaly detectors calibrated for wide operational fleet tolerances exhibit inherent blind spots against stealthy perturbations. Adversaries can induce severe hazardous delays (doubling HPR to 31.58%) without crossing PSI alert thresholds. Consequently, predictive maintenance security requires end-to-end cryptographic integrity controls in tandem with physics-informed invariant checking.</w:t>
       </w:r>
     </w:p>
     <w:p>
@@ -3174,7 +4188,7 @@
           <w:rFonts w:ascii="Times New Roman" w:hAnsi="Times New Roman"/>
           <w:sz w:val="20"/>
         </w:rPr>
-        <w:t>This investigation established the first comprehensive empirical evaluation of an integrity-assured predictive maintenance pipeline. We disambiguated dual evaluation protocols, resolved the run-to-failure censoring asymmetry, demonstrated that subtle sensor manipulations evade fleet drift screening while doubling the Hazardous Prediction Rate, and proved that Ed25519 cryptographic signing provides fail-closed artifact protection in 0.11 ms.</w:t>
+        <w:t>This investigation evaluated integrity controls and sensor-manipulation resilience in a turbofan predictive maintenance pipeline using NASA C-MAPSS FD001. We resolved the run-to-failure censoring asymmetry via a disjoint operational reference baseline, demonstrated that single-channel sensor manipulations can evade fleet-level drift alarms while doubling the Hazardous Prediction Rate to 31.58%, and confirmed that Ed25519 cryptographic signing provides fail-closed artifact protection with negligible computational overhead (0.13 ms).</w:t>
       </w:r>
     </w:p>
     <w:p>
@@ -3241,7 +4255,7 @@
           <w:rFonts w:ascii="Times New Roman" w:hAnsi="Times New Roman"/>
           <w:sz w:val="17"/>
         </w:rPr>
-        <w:t>[1] A. Saxena, K. Goebel, D. Simon, and N. Eklund, "Damage propagation modeling for aircraft engine run-to-failure simulation," in Proc. 2008 Int. Conf. Prognostics and Health Management (PHM), Denver, CO, USA, Oct. 2008, pp. 1–9, doi: 10.1109/PHM.2008.4711414.</w:t>
+        <w:t>[1] Saxena, A., Goebel, K., Simon, D., &amp; Eklund, N., "Damage Propagation Modeling for Aircraft Engine Run-to-Failure Simulation," Proc. IEEE Conf. on Prognostics and Health Management (PHM), 2008, doi: 10.1109/PHM.2008.4711414.</w:t>
       </w:r>
     </w:p>
     <w:p>
@@ -3254,7 +4268,7 @@
           <w:rFonts w:ascii="Times New Roman" w:hAnsi="Times New Roman"/>
           <w:sz w:val="17"/>
         </w:rPr>
-        <w:t>[2] F. O. Heimes, "Recurrent neural networks for remaining useful life estimation," in Proc. 2008 Int. Conf. Prognostics and Health Management (PHM), Denver, CO, USA, Oct. 2008, pp. 1–6, doi: 10.1109/PHM.2008.4711422.</w:t>
+        <w:t>[2] Ramasso, E., &amp; Saxena, A., "Performance Benchmarking and Analysis of Prognostic Methods for CMAPSS Datasets," International Journal of Prognostics and Health Management 5(2), 2014, doi: 10.36001/ijphm.2014.v5i2.2217.</w:t>
       </w:r>
     </w:p>
     <w:p>
@@ -3267,7 +4281,7 @@
           <w:rFonts w:ascii="Times New Roman" w:hAnsi="Times New Roman"/>
           <w:sz w:val="17"/>
         </w:rPr>
-        <w:t>[3] X. Li, Q. Ding, and J.-Q. Sun, "Remaining useful life estimation in prognostics using deep convolution neural networks," Reliability Engineering &amp; System Safety, vol. 172, pp. 1–11, Apr. 2018, doi: 10.1016/j.ress.2017.11.021.</w:t>
+        <w:t>[3] Zheng, S., Ristovski, K., Farahat, A., &amp; Gupta, C., "Long Short-Term Memory Network for Remaining Useful Life Estimation," Proc. IEEE Conf. on Prognostics and Health Management (PHM), 2017, doi: 10.1109/ICPHM.2017.7998311.</w:t>
       </w:r>
     </w:p>
     <w:p>
@@ -3280,7 +4294,7 @@
           <w:rFonts w:ascii="Times New Roman" w:hAnsi="Times New Roman"/>
           <w:sz w:val="17"/>
         </w:rPr>
-        <w:t>[4] N. Papernot, P. McDaniel, S. Jha, M. Fredrikson, Z. B. Celik, and A. Swami, "The limitations of deep learning in adversarial settings," in Proc. 2016 IEEE European Symp. Security and Privacy (EuroS&amp;P), Saarbrucken, Germany, Mar. 2016, pp. 372–387, doi: 10.1109/EuroSP.2016.36.</w:t>
+        <w:t>[4] Gu, T., Dolan-Gavitt, B., &amp; Garg, S., "BadNets: Identifying Vulnerabilities in the Machine Learning Model Supply Chain," IEEE Access 7, 2017, doi: 10.1109/ACCESS.2019.2923408.</w:t>
       </w:r>
     </w:p>
     <w:p>
@@ -3293,7 +4307,7 @@
           <w:rFonts w:ascii="Times New Roman" w:hAnsi="Times New Roman"/>
           <w:sz w:val="17"/>
         </w:rPr>
-        <w:t>[5] E. Al-Dujaili, A. Sanyal, and U.-M. O'Reilly, "Minimizing the threat of machine learning supply chain attacks," in Proc. 2021 IEEE Security and Privacy Workshops (SPW), San Francisco, CA, USA, May 2021, pp. 312–318, doi: 10.1109/SPW53761.2021.00049.</w:t>
+        <w:t>[5] Bernstein, D. J., Duif, N., Lange, T., Schwabe, P., &amp; Yang, B.-Y., "High-speed high-security signatures," Journal of Cryptographic Engineering 2(2), 2012, doi: 10.1007/s13389-012-0027-1.</w:t>
       </w:r>
     </w:p>
     <w:p>
@@ -3306,7 +4320,7 @@
           <w:rFonts w:ascii="Times New Roman" w:hAnsi="Times New Roman"/>
           <w:sz w:val="17"/>
         </w:rPr>
-        <w:t>[6] J. Boyens, A. Smith, N. Bartol, K. Winkler, and M. Paulsen, "Cybersecurity supply chain risk management practices for systems and organizations," NIST Special Publication 800-161 Rev. 1, National Institute of Standards and Technology, Gaithersburg, MD, May 2022, doi: 10.6028/NIST.SP.800-161r1.</w:t>
+        <w:t>[6] NIST (National Institute of Standards and Technology), "Secure Software Development Framework (SSDF) Version 1.1: Recommendations for Mitigating the Risk of Software Supply Chain Attacks," NIST Special Publication 800-218, 2022, doi: 10.6028/NIST.SP.800-218.</w:t>
       </w:r>
     </w:p>
     <w:p>
@@ -3319,7 +4333,7 @@
           <w:rFonts w:ascii="Times New Roman" w:hAnsi="Times New Roman"/>
           <w:sz w:val="17"/>
         </w:rPr>
-        <w:t>[7] Y. Mo, T. H.-J. Kim, K. Brancik, D. Dickinson, H. Lee, A. Perrig, and B. Sinopoli, "Cyber-physical security of a smart grid: Investment strategies, attacks, and defense," IEEE Trans. Smart Grid, vol. 3, no. 2, pp. 698–709, Jun. 2012, doi: 10.1109/TSG.2012.2183894.</w:t>
+        <w:t>[7] Fawaz, H. I., Forestier, G., Weber, J., Idoumghar, L., &amp; Muller, P.-A., "Adversarial Attacks on Deep Neural Networks for Time Series Classification," Proc. IEEE International Joint Conference on Neural Networks (IJCNN), 2019, doi: 10.1109/IJCNN.2019.8851936.</w:t>
       </w:r>
     </w:p>
     <w:p>
@@ -3332,7 +4346,7 @@
           <w:rFonts w:ascii="Times New Roman" w:hAnsi="Times New Roman"/>
           <w:sz w:val="17"/>
         </w:rPr>
-        <w:t>[8] G. Liang, J. Zhao, F. Luo, S. R. Weller, and Z. Y. Dong, "A review of false data injection attacks against modern power systems," IEEE Trans. Smart Grid, vol. 8, no. 4, pp. 1630–1638, Jul. 2017, doi: 10.1109/TSG.2015.2495126.</w:t>
+        <w:t>[8] Karim, F., Majumdar, S., &amp; Darabi, H., "Adversarial Attacks on Time Series," IEEE Access 8, 2020, doi: 10.1109/ACCESS.2020.2980424.</w:t>
       </w:r>
     </w:p>
     <w:p>
@@ -3345,7 +4359,7 @@
           <w:rFonts w:ascii="Times New Roman" w:hAnsi="Times New Roman"/>
           <w:sz w:val="17"/>
         </w:rPr>
-        <w:t>[9] T. Chen and C. Guestrin, "XGBoost: A scalable tree boosting system," in Proc. 22nd ACM SIGKDD Int. Conf. Knowledge Discovery and Data Mining (KDD), San Francisco, CA, USA, Aug. 2016, pp. 785–794, doi: 10.1145/2939672.2939785.</w:t>
+        <w:t>[9] Rabanser, S., Günnemann, S., &amp; Lipton, Z. C., "Failing Loudly: An Empirical Study of Methods for Detecting Dataset Shift," Advances in Neural Information Processing Systems (NeurIPS 32), 2019, doi: 10.48550/arXiv.1810.11953.</w:t>
       </w:r>
     </w:p>
     <w:p>
@@ -3358,7 +4372,7 @@
           <w:rFonts w:ascii="Times New Roman" w:hAnsi="Times New Roman"/>
           <w:sz w:val="17"/>
         </w:rPr>
-        <w:t>[10] E. Barker, "Recommendation for key management: Part 1 – General," NIST Special Publication 800-57 Part 1 Rev. 5, National Institute of Standards and Technology, Gaithersburg, MD, May 2020, doi: 10.6028/NIST.SP.800-57pt1r5.</w:t>
+        <w:t>[10] Siddiqi, N., "Credit Risk Scorecards: Developing and Implementing Intelligent Credit Scoring," John Wiley &amp; Sons, 2006, doi: 10.1002/9781119201731.</w:t>
       </w:r>
     </w:p>
     <w:p>
@@ -3371,7 +4385,7 @@
           <w:rFonts w:ascii="Times New Roman" w:hAnsi="Times New Roman"/>
           <w:sz w:val="17"/>
         </w:rPr>
-        <w:t>[11] S. Josefsson and I. Liusvaara, "Edwards-Curve Digital Signature Algorithm (EdDSA)," RFC 8032, Internet Engineering Task Force (IETF), Jan. 2017, doi: 10.17487/RFC8032.</w:t>
+        <w:t>[11] Massey, F. J., "The Kolmogorov-Smirnov Test for Goodness of Fit," Journal of the American Statistical Association 46(253), 1951, doi: 10.1080/01621459.1951.10500769.</w:t>
       </w:r>
     </w:p>
     <w:p>
@@ -3384,7 +4398,7 @@
           <w:rFonts w:ascii="Times New Roman" w:hAnsi="Times New Roman"/>
           <w:sz w:val="17"/>
         </w:rPr>
-        <w:t>[12] A. Rundgren, B. Jordan, and S. Erdtman, "JSON Canonicalization Scheme (JCS)," RFC 8785, Internet Engineering Task Force (IETF), Jun. 2020, doi: 10.17487/RFC8785.</w:t>
+        <w:t>[12] Mo, Y., Chabukswar, R., &amp; Sinopoli, B., "Detecting Integrity Attacks on Cyber-Physical Systems," IEEE Transactions on Control Systems Technology 22(4), 2014, doi: 10.1109/TCST.2013.2280899.</w:t>
       </w:r>
     </w:p>
     <w:p>
@@ -3397,7 +4411,7 @@
           <w:rFonts w:ascii="Times New Roman" w:hAnsi="Times New Roman"/>
           <w:sz w:val="17"/>
         </w:rPr>
-        <w:t>[13] European Union Aviation Safety Agency (EASA), "Notice of Proposed Amendment 2019-01: Management of information security risks," Cologne, Germany, Mar. 2019. [Online]. Available: https://www.easa.europa.eu/en/document-library/notices-of-proposed-amendment/npa-2019-01</w:t>
+        <w:t>[13] OWASP Foundation, "OWASP API Security Top 10 2023," OWASP Foundation, 2023. [Online]. Available: https://owasp.org/www-project-api-security/</w:t>
       </w:r>
     </w:p>
     <w:sectPr>
@@ -3425,7 +4439,7 @@
         <w:color w:val="808080"/>
         <w:sz w:val="17"/>
       </w:rPr>
-      <w:t>Page 1 of 10  |  AeroSentinel Research Consortium</w:t>
+      <w:t>AeroSentinel Research Consortium  |  NASA C-MAPSS Resilience Evaluation</w:t>
     </w:r>
   </w:p>
 </w:ftr>

</xml_diff>

<commit_message>
docs(manuscript): correct benchmark timing discussion
</commit_message>
<xml_diff>
--- a/docs/research/manuscript_aerosentinel_draft.docx
+++ b/docs/research/manuscript_aerosentinel_draft.docx
@@ -1853,7 +1853,7 @@
           <w:rFonts w:ascii="Times New Roman" w:hAnsi="Times New Roman"/>
           <w:sz w:val="20"/>
         </w:rPr>
-        <w:t>Six deterministic attack scenarios target sensor s11 (HPC static pressure, highest feature importance): sc1 (Step Bias +1.0σ), sc2 (Step Bias +2.0σ), sc3 (Negative Bias -1.0σ), sc4 (Creeping Linear Ramp +2.0σ), sc5 (Multi-Sensor Bias +1.0σ on s11, s9, s4), and sc6 (Frozen Replay at cycle 40%).</w:t>
+        <w:t>Six deterministic attack scenarios target sensor s11 (HPC static pressure, highest feature importance): sc1 (Step Bias +1.0σ), sc2 (Step Bias +2.0σ), sc3 (Negative Bias -1.0σ), sc4 (Creeping Linear Ramp +2.0σ), sc5 (Multi-Sensor Bias +1.0σ on s11, s9, s4), and sc6 (Frozen Replay at cycle 40%). Perturbation scales sigma(s_j) are calibrated strictly from the uncorrupted training baseline (train_FD001.txt) to preserve operational realism and ensure zero data leakage from evaluation trajectories.</w:t>
       </w:r>
     </w:p>
     <w:p>
@@ -4603,7 +4603,7 @@
           <w:i/>
           <w:sz w:val="17"/>
         </w:rPr>
-        <w:t>Fig. 4. Multi-channel Population Stability Index (PSI) heatmap demonstrating drift detector evasion.</w:t>
+        <w:t>Fig. 4. Fleet-wide sensor distribution drift (PSI) evaluated across the full 100-engine test fleet relative to clean operational telemetry (drift_clean), illustrating detection evasion in single-sensor bias and ramp attacks. Table III reports corresponding operational detection under the disjoint 50/50 calibration/evaluation partition (drift_disjoint).</w:t>
       </w:r>
     </w:p>
     <w:p>
@@ -6001,7 +6001,7 @@
           <w:rFonts w:ascii="Times New Roman" w:hAnsi="Times New Roman"/>
           <w:sz w:val="20"/>
         </w:rPr>
-        <w:t>Microbenchmarks across N=100 independent trials confirm that pure Ed25519 signature verification requires only 0.13 ± 0.02 ms (median 0.11 ms), contributing less than 0.6% of the total 24.37 ms verified startup latency. Fleet batch inference for 100 engines executes in 1.34 ms (13.4 µs/engine), and full 15-sensor drift screening executes in 100.73 ms.</w:t>
+        <w:t>Microbenchmarks across N=100 independent trials confirm that pure Ed25519 signature verification requires only 0.13 ± 0.02 ms (median 0.11 ms), contributing less than 0.6% of the total 24.37 ms verified startup latency. Fleet batch inference for 100 engines executes in 1.34 ms (13.4 µs/engine), and full 15-sensor drift screening executes in 100.73 ms. Across independent benchmarking iterations (initial profiling in Fig. 5 vs Table V vs companion re-benchmark in performance_benchmarks.csv), component measurements vary by up to 19.2% for Ed25519 and 11.9% for deserialization (composite startup varying by 5.6%), with sub-millisecond cryptographic overhead confirmed across all trials.</w:t>
       </w:r>
     </w:p>
     <w:p>
@@ -7204,7 +7204,7 @@
           <w:i/>
           <w:sz w:val="17"/>
         </w:rPr>
-        <w:t>Fig. 5. Computational latency breakdown across pipeline stages (N = 100 repetitions).</w:t>
+        <w:t>Fig. 5. Computational latency breakdown across pipeline stages (N = 100 repetitions; component values illustrate the initial profiling run, while Table V reports the multi-trial benchmark distribution; across all runs, signature overhead remains under 0.15 ms, &lt;0.6% of startup).</w:t>
       </w:r>
     </w:p>
     <w:p>

</xml_diff>

<commit_message>
docs(manuscript): reconcile sensor list and benchmark timing
</commit_message>
<xml_diff>
--- a/docs/research/manuscript_aerosentinel_draft.docx
+++ b/docs/research/manuscript_aerosentinel_draft.docx
@@ -6001,7 +6001,7 @@
           <w:rFonts w:ascii="Times New Roman" w:hAnsi="Times New Roman"/>
           <w:sz w:val="20"/>
         </w:rPr>
-        <w:t>Microbenchmarks across N=100 independent trials confirm that pure Ed25519 signature verification requires only 0.13 ± 0.02 ms (median 0.11 ms), contributing less than 0.6% of the total 24.37 ms verified startup latency. Fleet batch inference for 100 engines executes in 1.34 ms (13.4 µs/engine), and full 15-sensor drift screening executes in 100.73 ms. Across independent benchmarking iterations (initial profiling in Fig. 5 vs Table V vs companion re-benchmark in performance_benchmarks.csv), component measurements vary by up to 19.2% for Ed25519 and 11.9% for deserialization (composite startup varying by 5.6%), with sub-millisecond cryptographic overhead confirmed across all trials.</w:t>
+        <w:t>Microbenchmarks across N=100 independent trials confirm that pure Ed25519 signature verification requires only 0.13 ± 0.02 ms (median 0.11 ms), contributing less than 0.6% of the total 24.37 ms verified startup latency. Fleet batch inference for 100 engines executes in 1.34 ms (13.4 µs/engine), and full 15-sensor drift screening executes in 100.73 ms. To interpret these measurements across operational contexts, four latency regimes are distinguished: (1) Artifact-Loading Overhead: A one-time startup initialization cost (Table V reports 24.37 ms composite mean from N=100 trials; isolated component means sum to 24.53 ms, within 0.16 ms of composite timing). Across distinct benchmark records, measurements reflect the specific evaluation context: the initial profiling run plotted in Fig. 5 (0.11 ms Ed25519, 15.34 ms SHA-256, 9.56 ms deserialization; summing to 25.01 ms); Table V multi-trial benchmarks (0.13 ms Ed25519, 14.93 ms SHA-256, 9.47 ms deserialization, 24.37 ms composite); and the companion multi-trial benchmark recorded in performance_benchmarks.csv (0.105 ms Ed25519, 14.04 ms SHA-256, 8.35 ms deserialization, 23.01 ms composite). Between multi-trial runs, component means differ by 19.23% for Ed25519, 5.98% for SHA-256, 11.87% for deserialization, and 5.57% for composite startup. Across all trials, Ed25519 verification remains ≤ 0.13 ms (&lt;0.6% of startup). (2) Single-Engine Inference: 1.39 ms mean (1.16 ms median in Table V; 1.30 ms in performance_benchmarks.csv), with ~1.1 ms consumed by array validation. (3) Fleet Batch Inference: 1.34 ms mean for 100 engines (13.4 µs/engine; 1.28 ms in performance_benchmarks.csv). (4) Drift Screening: 100.73 ms across 13,096 cycles (93.99 ms in performance_benchmarks.csv).</w:t>
       </w:r>
     </w:p>
     <w:p>
@@ -7204,7 +7204,7 @@
           <w:i/>
           <w:sz w:val="17"/>
         </w:rPr>
-        <w:t>Fig. 5. Computational latency breakdown across pipeline stages (N = 100 repetitions; component values illustrate the initial profiling run, while Table V reports the multi-trial benchmark distribution; across all runs, signature overhead remains under 0.15 ms, &lt;0.6% of startup).</w:t>
+        <w:t>Fig. 5. Computational latency breakdown of verified pipeline startup stages. Bar labels display the initial profiling run (0.11 ms Ed25519, 15.34 ms SHA-256, 9.56 ms deserialization; summing to 25.01 ms), while Table V reports the multi-trial benchmark distribution (N = 100, 24.37 ms composite mean, 0.13 ms Ed25519); across all evaluations, cryptographic overhead remains under 0.15 ms (&lt;0.6% of startup).</w:t>
       </w:r>
     </w:p>
     <w:p>
@@ -7322,7 +7322,7 @@
           <w:rFonts w:ascii="Times New Roman" w:hAnsi="Times New Roman"/>
           <w:sz w:val="20"/>
         </w:rPr>
-        <w:t>The authors express gratitude to the NASA Ames Prognostics Center of Excellence. No external commercial funding was received. All reproducible artifacts, scripts, and cryptographic keys are available in the AeroSentinel repository.</w:t>
+        <w:t>The authors express gratitude to the NASA Ames Prognostics Center of Excellence. No external commercial funding was received. All reproducible artifacts, evaluation manifests, cryptographic public verification keys, and benchmark generation tools are accessible in the AeroSentinel repository; private signing keys are strictly quarantined offline.</w:t>
       </w:r>
     </w:p>
     <w:p>

</xml_diff>